<commit_message>
docs(manuais): atualizar suite completa de manuais para refletir APKs offline, render e banco limpo
</commit_message>
<xml_diff>
--- a/xiquimvargasmanuais/01_Manual_de_Operacoes_AutonomIA_ERP_2.2.1.docx
+++ b/xiquimvargasmanuais/01_Manual_de_Operacoes_AutonomIA_ERP_2.2.1.docx
@@ -1,5 +1,70 @@
 
-<file path=word/document.xml><?xml version="1.0" encoding="utf-8"?>
+<file path=customXml\item1.xml><?xml version="1.0" encoding="utf-8"?>
+<b:Sources xmlns:b="http://schemas.openxmlformats.org/officeDocument/2006/bibliography" xmlns="http://schemas.openxmlformats.org/officeDocument/2006/bibliography" SelectedStyle="/APA.XSL" StyleName="APA"/>
+</file>
+
+<file path=customXml\itemProps1.xml><?xml version="1.0" encoding="utf-8"?>
+<ds:datastoreItem xmlns:ds="http://schemas.openxmlformats.org/officeDocument/2006/customXml" ds:itemID="{EF278816-EC6F-A645-907D-7F25AECB1D4A}">
+  <ds:schemaRefs>
+    <ds:schemaRef ds:uri="http://schemas.openxmlformats.org/officeDocument/2006/bibliography"/>
+  </ds:schemaRefs>
+</ds:datastoreItem>
+</file>
+
+<file path=docProps\app.xml><?xml version="1.0" encoding="utf-8"?>
+<Properties xmlns="http://schemas.openxmlformats.org/officeDocument/2006/extended-properties" xmlns:vt="http://schemas.openxmlformats.org/officeDocument/2006/docPropsVTypes">
+  <Template>Normal.dotm</Template>
+  <TotalTime>0</TotalTime>
+  <Pages>1</Pages>
+  <Words>0</Words>
+  <Characters>0</Characters>
+  <Application>Microsoft Macintosh Word</Application>
+  <DocSecurity>0</DocSecurity>
+  <Lines>0</Lines>
+  <Paragraphs>0</Paragraphs>
+  <ScaleCrop>false</ScaleCrop>
+  <HeadingPairs>
+    <vt:vector size="2" baseType="variant">
+      <vt:variant>
+        <vt:lpstr>Title</vt:lpstr>
+      </vt:variant>
+      <vt:variant>
+        <vt:i4>1</vt:i4>
+      </vt:variant>
+    </vt:vector>
+  </HeadingPairs>
+  <TitlesOfParts>
+    <vt:vector size="1" baseType="lpstr">
+      <vt:lpstr/>
+    </vt:vector>
+  </TitlesOfParts>
+  <Manager/>
+  <Company/>
+  <LinksUpToDate>false</LinksUpToDate>
+  <CharactersWithSpaces>0</CharactersWithSpaces>
+  <SharedDoc>false</SharedDoc>
+  <HyperlinkBase/>
+  <HyperlinksChanged>false</HyperlinksChanged>
+  <AppVersion>14.0000</AppVersion>
+</Properties>
+</file>
+
+<file path=docProps\core.xml><?xml version="1.0" encoding="utf-8"?>
+<cp:coreProperties xmlns:cp="http://schemas.openxmlformats.org/package/2006/metadata/core-properties" xmlns:dc="http://purl.org/dc/elements/1.1/" xmlns:dcterms="http://purl.org/dc/terms/" xmlns:dcmitype="http://purl.org/dc/dcmitype/" xmlns:xsi="http://www.w3.org/2001/XMLSchema-instance">
+  <dc:title/>
+  <dc:subject/>
+  <dc:creator>python-docx</dc:creator>
+  <cp:keywords/>
+  <dc:description>generated by python-docx</dc:description>
+  <cp:lastModifiedBy/>
+  <cp:revision>1</cp:revision>
+  <dcterms:created xsi:type="dcterms:W3CDTF">2013-12-23T23:15:00Z</dcterms:created>
+  <dcterms:modified xsi:type="dcterms:W3CDTF">2013-12-23T23:15:00Z</dcterms:modified>
+  <cp:category/>
+</cp:coreProperties>
+</file>
+
+<file path=word\document.xml><?xml version="1.0" encoding="utf-8"?>
 <w:document xmlns:wpc="http://schemas.microsoft.com/office/word/2010/wordprocessingCanvas" xmlns:mo="http://schemas.microsoft.com/office/mac/office/2008/main" xmlns:mc="http://schemas.openxmlformats.org/markup-compatibility/2006" xmlns:mv="urn:schemas-microsoft-com:mac:vml" xmlns:o="urn:schemas-microsoft-com:office:office" xmlns:r="http://schemas.openxmlformats.org/officeDocument/2006/relationships" xmlns:m="http://schemas.openxmlformats.org/math" xmlns:v="urn:schemas-microsoft-com:vml" xmlns:wp14="http://schemas.microsoft.com/office/word/2010/wordprocessingDrawing" xmlns:wp="http://schemas.openxmlformats.org/drawingml/2006/wordprocessingDrawing" xmlns:w10="urn:schemas-microsoft-com:office:word" xmlns:w="http://schemas.openxmlformats.org/wordprocessingml/2006/main" xmlns:w14="http://schemas.microsoft.com/office/word/2010/wordml" xmlns:wpg="http://schemas.microsoft.com/office/word/2010/wordprocessingGroup" xmlns:wpi="http://schemas.microsoft.com/office/word/2010/wordprocessingInk" xmlns:wne="http://schemas.microsoft.com/office/word/2006/wordml" xmlns:wps="http://schemas.microsoft.com/office/word/2010/wordprocessingShape" mc:Ignorable="w14 wp14">
   <w:body>
     <w:p>
@@ -2093,71 +2158,6 @@
 </w:document>
 </file>
 
-<file path=customXml\item1.xml><?xml version="1.0" encoding="utf-8"?>
-<b:Sources xmlns:b="http://schemas.openxmlformats.org/officeDocument/2006/bibliography" xmlns="http://schemas.openxmlformats.org/officeDocument/2006/bibliography" SelectedStyle="/APA.XSL" StyleName="APA"/>
-</file>
-
-<file path=customXml\itemProps1.xml><?xml version="1.0" encoding="utf-8"?>
-<ds:datastoreItem xmlns:ds="http://schemas.openxmlformats.org/officeDocument/2006/customXml" ds:itemID="{EF278816-EC6F-A645-907D-7F25AECB1D4A}">
-  <ds:schemaRefs>
-    <ds:schemaRef ds:uri="http://schemas.openxmlformats.org/officeDocument/2006/bibliography"/>
-  </ds:schemaRefs>
-</ds:datastoreItem>
-</file>
-
-<file path=docProps\app.xml><?xml version="1.0" encoding="utf-8"?>
-<Properties xmlns="http://schemas.openxmlformats.org/officeDocument/2006/extended-properties" xmlns:vt="http://schemas.openxmlformats.org/officeDocument/2006/docPropsVTypes">
-  <Template>Normal.dotm</Template>
-  <TotalTime>0</TotalTime>
-  <Pages>1</Pages>
-  <Words>0</Words>
-  <Characters>0</Characters>
-  <Application>Microsoft Macintosh Word</Application>
-  <DocSecurity>0</DocSecurity>
-  <Lines>0</Lines>
-  <Paragraphs>0</Paragraphs>
-  <ScaleCrop>false</ScaleCrop>
-  <HeadingPairs>
-    <vt:vector size="2" baseType="variant">
-      <vt:variant>
-        <vt:lpstr>Title</vt:lpstr>
-      </vt:variant>
-      <vt:variant>
-        <vt:i4>1</vt:i4>
-      </vt:variant>
-    </vt:vector>
-  </HeadingPairs>
-  <TitlesOfParts>
-    <vt:vector size="1" baseType="lpstr">
-      <vt:lpstr/>
-    </vt:vector>
-  </TitlesOfParts>
-  <Manager/>
-  <Company/>
-  <LinksUpToDate>false</LinksUpToDate>
-  <CharactersWithSpaces>0</CharactersWithSpaces>
-  <SharedDoc>false</SharedDoc>
-  <HyperlinkBase/>
-  <HyperlinksChanged>false</HyperlinksChanged>
-  <AppVersion>14.0000</AppVersion>
-</Properties>
-</file>
-
-<file path=docProps\core.xml><?xml version="1.0" encoding="utf-8"?>
-<cp:coreProperties xmlns:cp="http://schemas.openxmlformats.org/package/2006/metadata/core-properties" xmlns:dc="http://purl.org/dc/elements/1.1/" xmlns:dcterms="http://purl.org/dc/terms/" xmlns:dcmitype="http://purl.org/dc/dcmitype/" xmlns:xsi="http://www.w3.org/2001/XMLSchema-instance">
-  <dc:title/>
-  <dc:subject/>
-  <dc:creator>python-docx</dc:creator>
-  <cp:keywords/>
-  <dc:description>generated by python-docx</dc:description>
-  <cp:lastModifiedBy/>
-  <cp:revision>1</cp:revision>
-  <dcterms:created xsi:type="dcterms:W3CDTF">2013-12-23T23:15:00Z</dcterms:created>
-  <dcterms:modified xsi:type="dcterms:W3CDTF">2013-12-23T23:15:00Z</dcterms:modified>
-  <cp:category/>
-</cp:coreProperties>
-</file>
-
 <file path=word\fontTable.xml><?xml version="1.0" encoding="utf-8"?>
 <w:fonts xmlns:mc="http://schemas.openxmlformats.org/markup-compatibility/2006" xmlns:r="http://schemas.openxmlformats.org/officeDocument/2006/relationships" xmlns:w="http://schemas.openxmlformats.org/wordprocessingml/2006/main" xmlns:w14="http://schemas.microsoft.com/office/word/2010/wordml" mc:Ignorable="w14">
   <w:font w:name="Symbol">

</xml_diff>

<commit_message>
fix: ajustes de estoque, logistica, tabela de precos com qtd minima e precedencia individual, painel de vendedores e APKs
</commit_message>
<xml_diff>
--- a/xiquimvargasmanuais/01_Manual_de_Operacoes_AutonomIA_ERP_2.2.1.docx
+++ b/xiquimvargasmanuais/01_Manual_de_Operacoes_AutonomIA_ERP_2.2.1.docx
@@ -108,497 +108,590 @@
     </w:p>
     <w:p>
       <w:pPr>
-        <w:jc w:val="center"/>
+        <w:pStyle w:val="Heading1"/>
+        <w:spacing w:before="280" w:after="120"/>
       </w:pPr>
       <w:r>
         <w:rPr>
-          <w:rFonts w:ascii="Calibri" w:hAnsi="Calibri" w:eastAsia="Calibri"/>
           <w:b/>
           <w:color w:val="061A4F"/>
-          <w:sz w:val="28"/>
+          <w:sz w:val="32"/>
         </w:rPr>
-        <w:t>AUTONOMIA SYSTEMS</w:t>
+        <w:t xml:space="preserve">AUTONOMIA SYSTEMS — MANUAL DE OPERAÇÕES</w:t>
       </w:r>
     </w:p>
     <w:p>
       <w:pPr>
-        <w:jc w:val="center"/>
+        <w:spacing w:after="120" w:line="260" w:lineRule="auto"/>
       </w:pPr>
       <w:r>
         <w:rPr>
-          <w:rFonts w:ascii="Calibri" w:hAnsi="Calibri" w:eastAsia="Calibri"/>
           <w:b/>
           <w:color w:val="061A4F"/>
-          <w:sz w:val="44"/>
+          <w:sz w:val="22"/>
         </w:rPr>
-        <w:t>Manual de OperaÃ§Ãµes</w:t>
+        <w:t xml:space="preserve">Guia Operacional e Funcional Completo do Dia a Dia</w:t>
       </w:r>
     </w:p>
     <w:p>
       <w:pPr>
-        <w:jc w:val="center"/>
+        <w:spacing w:after="120" w:line="260" w:lineRule="auto"/>
       </w:pPr>
       <w:r>
         <w:rPr>
-          <w:rFonts w:ascii="Calibri" w:hAnsi="Calibri" w:eastAsia="Calibri"/>
-          <w:b w:val="0"/>
-          <w:color w:val="555555"/>
-          <w:sz w:val="24"/>
+          <w:b/>
+          <w:color w:val="061A4F"/>
+          <w:sz w:val="22"/>
         </w:rPr>
-        <w:t>Guia operacional e funcional completo do dia a dia</w:t>
+        <w:t xml:space="preserve">Versão:</w:t>
+      </w:r>
+      <w:r>
+        <w:rPr>
+          <w:color w:val="333333"/>
+          <w:sz w:val="22"/>
+        </w:rPr>
+        <w:t xml:space="preserve"> 2.2.1 / 1.8.2 Delivery Hardened | </w:t>
+      </w:r>
+      <w:r>
+        <w:rPr>
+          <w:b/>
+          <w:color w:val="061A4F"/>
+          <w:sz w:val="22"/>
+        </w:rPr>
+        <w:t xml:space="preserve">APKs Nativos:</w:t>
+      </w:r>
+      <w:r>
+        <w:rPr>
+          <w:color w:val="333333"/>
+          <w:sz w:val="22"/>
+        </w:rPr>
+        <w:t xml:space="preserve"> v1.8.3 (100% Offline)</w:t>
       </w:r>
     </w:p>
     <w:p>
       <w:pPr>
-        <w:jc w:val="center"/>
+        <w:spacing w:after="120" w:line="260" w:lineRule="auto"/>
       </w:pPr>
       <w:r>
         <w:rPr>
-          <w:rFonts w:ascii="Calibri" w:hAnsi="Calibri" w:eastAsia="Calibri"/>
           <w:b/>
-          <w:color w:val="0B3D91"/>
+          <w:color w:val="061A4F"/>
           <w:sz w:val="22"/>
         </w:rPr>
-        <w:t>VersÃ£o 2.2.1  Â·  Outubro de 2026</w:t>
+        <w:t xml:space="preserve">Ambiente Oficial de Produção:</w:t>
+      </w:r>
+      <w:r>
+        <w:rPr>
+          <w:color w:val="333333"/>
+          <w:sz w:val="22"/>
+        </w:rPr>
+        <w:t xml:space="preserve"> https://xiquim-vargas-erp.onrender.com | </w:t>
+      </w:r>
+      <w:r>
+        <w:rPr>
+          <w:b/>
+          <w:color w:val="061A4F"/>
+          <w:sz w:val="22"/>
+        </w:rPr>
+        <w:t xml:space="preserve">Data:</w:t>
+      </w:r>
+      <w:r>
+        <w:rPr>
+          <w:color w:val="333333"/>
+          <w:sz w:val="22"/>
+        </w:rPr>
+        <w:t xml:space="preserve"> Outubro de 2026</w:t>
       </w:r>
     </w:p>
     <w:p>
       <w:pPr>
-        <w:jc w:val="center"/>
+        <w:pStyle w:val="Heading2"/>
+        <w:spacing w:before="220" w:after="100"/>
       </w:pPr>
       <w:r>
         <w:rPr>
-          <w:rFonts w:ascii="Calibri" w:hAnsi="Calibri" w:eastAsia="Calibri"/>
-          <w:b w:val="0"/>
-          <w:color w:val="555555"/>
-          <w:sz w:val="20"/>
+          <w:b/>
+          <w:color w:val="FD5E02"/>
+          <w:sz w:val="26"/>
         </w:rPr>
-        <w:t>Documento oficial de entrega de software</w:t>
-      </w:r>
-    </w:p>
-    <w:p>
-      <w:r>
-        <w:br w:type="page"/>
+        <w:t xml:space="preserve">1. PROPÓSITO E ARQUITETURA DE CANAIS</w:t>
       </w:r>
     </w:p>
     <w:p>
       <w:pPr>
-        <w:spacing w:before="240" w:after="160"/>
+        <w:spacing w:after="120" w:line="260" w:lineRule="auto"/>
       </w:pPr>
       <w:r>
         <w:rPr>
-          <w:rFonts w:ascii="Calibri" w:hAnsi="Calibri" w:eastAsia="Calibri"/>
+          <w:color w:val="333333"/>
+          <w:sz w:val="22"/>
+        </w:rPr>
+        <w:t xml:space="preserve">O </w:t>
+      </w:r>
+      <w:r>
+        <w:rPr>
           <w:b/>
           <w:color w:val="061A4F"/>
-          <w:sz w:val="36"/>
+          <w:sz w:val="22"/>
         </w:rPr>
-        <w:t>1. PropÃ³sito e Arquitetura de Canais</w:t>
+        <w:t xml:space="preserve">ERP AutonomIA (Xiquim Vargas)</w:t>
+      </w:r>
+      <w:r>
+        <w:rPr>
+          <w:color w:val="333333"/>
+          <w:sz w:val="22"/>
+        </w:rPr>
+        <w:t xml:space="preserve"> é uma plataforma integrada de gestão empresarial desenvolvida para unificar de ponta a ponta todas as frentes de atendimento, vendas omni-channel, faturamento de balcão (PDV), gestão dinâmica de preços, controle rigoroso de estoque, compras e doca de recebimento (inbound), inteligência comercial de clientes (CRM) e expedição logística com rastreamento móvel nativo.</w:t>
       </w:r>
     </w:p>
     <w:p>
       <w:pPr>
-        <w:spacing w:after="120" w:line="276" w:lineRule="auto"/>
+        <w:spacing w:after="120" w:line="260" w:lineRule="auto"/>
       </w:pPr>
       <w:r>
         <w:rPr>
-          <w:rFonts w:ascii="Calibri" w:hAnsi="Calibri" w:eastAsia="Calibri"/>
-          <w:b w:val="0"/>
           <w:color w:val="333333"/>
           <w:sz w:val="22"/>
         </w:rPr>
-        <w:t xml:space="preserve">O ERP AutonomIA Ã© uma plataforma integrada de gestÃ£o empresarial desenvolvida para unificar de ponta a ponta as frentes de atendimento, vendas omni-channel, gestÃ£o de preÃ§os, controle rigoroso de estoque, compras e doca de recebimento, inteligÃªncia de clientes e expediÃ§Ã£o logÃ­stica com rastreamento mÃ³vel.</w:t>
-      </w:r>
-    </w:p>
-    <w:p>
-      <w:pPr>
-        <w:spacing w:after="120" w:line="276" w:lineRule="auto"/>
-      </w:pPr>
-      <w:r>
-        <w:rPr>
-          <w:rFonts w:ascii="Calibri" w:hAnsi="Calibri" w:eastAsia="Calibri"/>
-          <w:b w:val="0"/>
-          <w:color w:val="333333"/>
-          <w:sz w:val="22"/>
-        </w:rPr>
-        <w:t xml:space="preserve">A soluÃ§Ã£o atende simultaneamente aos mÃºltiplos canais de venda da operaÃ§Ã£o, assegurando que todas as interfaces compartilhem a mesma base de dados transacional e regras de negÃ³cio centralizadas no servidor:</w:t>
+        <w:t xml:space="preserve">A solução atende simultaneamente aos múltiplos canais operacionais integrados à mesma base de dados transacional em tempo real:</w:t>
       </w:r>
     </w:p>
     <w:p>
       <w:pPr>
         <w:pStyle w:val="ListBullet"/>
-        <w:spacing w:after="80" w:line="260" w:lineRule="auto"/>
+        <w:spacing w:after="60" w:line="240" w:lineRule="auto"/>
       </w:pPr>
       <w:r>
         <w:rPr>
-          <w:rFonts w:ascii="Calibri" w:hAnsi="Calibri" w:eastAsia="Calibri"/>
           <w:b/>
           <w:color w:val="061A4F"/>
           <w:sz w:val="22"/>
         </w:rPr>
-        <w:t xml:space="preserve">â€¢ Loja Online (Web E-Commerce): </w:t>
+        <w:t xml:space="preserve">Torre de Controle (Gestão Central):</w:t>
       </w:r>
       <w:r>
         <w:rPr>
-          <w:rFonts w:ascii="Calibri" w:hAnsi="Calibri" w:eastAsia="Calibri"/>
-          <w:b w:val="0"/>
           <w:color w:val="333333"/>
           <w:sz w:val="22"/>
         </w:rPr>
-        <w:t xml:space="preserve">Canal digital de autoatendimento para clientes finais e corporativos, com catÃ¡logo dinÃ¢mico de produtos, cÃ¡lculo de taxa de entrega por bairro e acompanhamento de status do pedido.</w:t>
+        <w:t xml:space="preserve"> Centro de comando executivo em </w:t>
+      </w:r>
+      <w:r>
+        <w:rPr>
+          <w:rFonts w:ascii="Consolas" w:hAnsi="Consolas"/>
+          <w:color w:val="C7254E"/>
+          <w:shd w:val="clear" w:color="auto" w:fill="F9F2F4"/>
+          <w:sz w:val="20"/>
+        </w:rPr>
+        <w:t xml:space="preserve">admin.html</w:t>
+      </w:r>
+      <w:r>
+        <w:rPr>
+          <w:color w:val="333333"/>
+          <w:sz w:val="22"/>
+        </w:rPr>
+        <w:t xml:space="preserve"> ou pelo aplicativo nativo </w:t>
+      </w:r>
+      <w:r>
+        <w:rPr>
+          <w:rFonts w:ascii="Consolas" w:hAnsi="Consolas"/>
+          <w:color w:val="C7254E"/>
+          <w:shd w:val="clear" w:color="auto" w:fill="F9F2F4"/>
+          <w:sz w:val="20"/>
+        </w:rPr>
+        <w:t xml:space="preserve">XiquimVargas-TorreControle-1.8.3.apk</w:t>
+      </w:r>
+      <w:r>
+        <w:rPr>
+          <w:color w:val="333333"/>
+          <w:sz w:val="22"/>
+        </w:rPr>
+        <w:t xml:space="preserve">, com dashboards em tempo real, painel Kanban de pedidos, estoque central, precificação, liberação de cargas e monitoramento de retornos logísticos.</w:t>
       </w:r>
     </w:p>
     <w:p>
       <w:pPr>
         <w:pStyle w:val="ListBullet"/>
-        <w:spacing w:after="80" w:line="260" w:lineRule="auto"/>
+        <w:spacing w:after="60" w:line="240" w:lineRule="auto"/>
       </w:pPr>
       <w:r>
         <w:rPr>
-          <w:rFonts w:ascii="Calibri" w:hAnsi="Calibri" w:eastAsia="Calibri"/>
           <w:b/>
           <w:color w:val="061A4F"/>
           <w:sz w:val="22"/>
         </w:rPr>
-        <w:t xml:space="preserve">â€¢ Venda Externa (App Vendedor): </w:t>
+        <w:t xml:space="preserve">Frente de Caixa e Balcão (PDV):</w:t>
       </w:r>
       <w:r>
         <w:rPr>
-          <w:rFonts w:ascii="Calibri" w:hAnsi="Calibri" w:eastAsia="Calibri"/>
-          <w:b w:val="0"/>
           <w:color w:val="333333"/>
           <w:sz w:val="22"/>
         </w:rPr>
-        <w:t xml:space="preserve">Interface mÃ³vel para vendedores em campo, com consulta de catÃ¡logo e estoque disponÃ­vel em tempo real, gestÃ£o de carteira de clientes, metas e suporte a vendas offline via outbox sincronizÃ¡vel.</w:t>
+        <w:t xml:space="preserve"> Terminal de alta velocidade em </w:t>
+      </w:r>
+      <w:r>
+        <w:rPr>
+          <w:rFonts w:ascii="Consolas" w:hAnsi="Consolas"/>
+          <w:color w:val="C7254E"/>
+          <w:shd w:val="clear" w:color="auto" w:fill="F9F2F4"/>
+          <w:sz w:val="20"/>
+        </w:rPr>
+        <w:t xml:space="preserve">pdv.html</w:t>
+      </w:r>
+      <w:r>
+        <w:rPr>
+          <w:color w:val="333333"/>
+          <w:sz w:val="22"/>
+        </w:rPr>
+        <w:t xml:space="preserve"> ou pelo aplicativo nativo </w:t>
+      </w:r>
+      <w:r>
+        <w:rPr>
+          <w:rFonts w:ascii="Consolas" w:hAnsi="Consolas"/>
+          <w:color w:val="C7254E"/>
+          <w:shd w:val="clear" w:color="auto" w:fill="F9F2F4"/>
+          <w:sz w:val="20"/>
+        </w:rPr>
+        <w:t xml:space="preserve">XiquimVargas-PDV-1.8.3.apk</w:t>
+      </w:r>
+      <w:r>
+        <w:rPr>
+          <w:color w:val="333333"/>
+          <w:sz w:val="22"/>
+        </w:rPr>
+        <w:t xml:space="preserve"> (também distribuído como </w:t>
+      </w:r>
+      <w:r>
+        <w:rPr>
+          <w:rFonts w:ascii="Consolas" w:hAnsi="Consolas"/>
+          <w:color w:val="C7254E"/>
+          <w:shd w:val="clear" w:color="auto" w:fill="F9F2F4"/>
+          <w:sz w:val="20"/>
+        </w:rPr>
+        <w:t xml:space="preserve">XiquimVargas-Caixa-1.8.3.apk</w:t>
+      </w:r>
+      <w:r>
+        <w:rPr>
+          <w:color w:val="333333"/>
+          <w:sz w:val="22"/>
+        </w:rPr>
+        <w:t xml:space="preserve">), com suporte a leitor de código de barras, múltiplos meios de pagamento (Dinheiro, Débito, Crédito à vista/parcelado de 2x a 12x, PIX), cálculo de troco automático e impressão térmica.</w:t>
       </w:r>
     </w:p>
     <w:p>
       <w:pPr>
         <w:pStyle w:val="ListBullet"/>
-        <w:spacing w:after="80" w:line="260" w:lineRule="auto"/>
+        <w:spacing w:after="60" w:line="240" w:lineRule="auto"/>
       </w:pPr>
       <w:r>
         <w:rPr>
-          <w:rFonts w:ascii="Calibri" w:hAnsi="Calibri" w:eastAsia="Calibri"/>
           <w:b/>
           <w:color w:val="061A4F"/>
           <w:sz w:val="22"/>
         </w:rPr>
-        <w:t xml:space="preserve">â€¢ Frente de Caixa e BalcÃ£o (PDV): </w:t>
+        <w:t xml:space="preserve">Venda Externa (App Vendedor):</w:t>
       </w:r>
       <w:r>
         <w:rPr>
-          <w:rFonts w:ascii="Calibri" w:hAnsi="Calibri" w:eastAsia="Calibri"/>
-          <w:b w:val="0"/>
           <w:color w:val="333333"/>
           <w:sz w:val="22"/>
         </w:rPr>
-        <w:t xml:space="preserve">Terminal Ã¡gil para venda fÃ­sica presencial, com suporte a leitores de cÃ³digo de barras, mÃºltiplos meios de pagamento (Dinheiro, CartÃ£o, PIX), emissÃ£o de comprovantes e operaÃ§Ã£o contÃ­nua.</w:t>
+        <w:t xml:space="preserve"> Aplicativo móvel nativo (</w:t>
+      </w:r>
+      <w:r>
+        <w:rPr>
+          <w:rFonts w:ascii="Consolas" w:hAnsi="Consolas"/>
+          <w:color w:val="C7254E"/>
+          <w:shd w:val="clear" w:color="auto" w:fill="F9F2F4"/>
+          <w:sz w:val="20"/>
+        </w:rPr>
+        <w:t xml:space="preserve">XiquimVargas-Vendedor-1.8.3.apk</w:t>
+      </w:r>
+      <w:r>
+        <w:rPr>
+          <w:color w:val="333333"/>
+          <w:sz w:val="22"/>
+        </w:rPr>
+        <w:t xml:space="preserve"> ou </w:t>
+      </w:r>
+      <w:r>
+        <w:rPr>
+          <w:rFonts w:ascii="Consolas" w:hAnsi="Consolas"/>
+          <w:color w:val="C7254E"/>
+          <w:shd w:val="clear" w:color="auto" w:fill="F9F2F4"/>
+          <w:sz w:val="20"/>
+        </w:rPr>
+        <w:t xml:space="preserve">vendedor.html</w:t>
+      </w:r>
+      <w:r>
+        <w:rPr>
+          <w:color w:val="333333"/>
+          <w:sz w:val="22"/>
+        </w:rPr>
+        <w:t xml:space="preserve">) com catálogo completo de 620 produtos ativos, gestão de carteira de clientes, metas mensais, histórico de compras e emissão de pedidos com outbox offline sincronizável.</w:t>
       </w:r>
     </w:p>
     <w:p>
       <w:pPr>
         <w:pStyle w:val="ListBullet"/>
-        <w:spacing w:after="80" w:line="260" w:lineRule="auto"/>
+        <w:spacing w:after="60" w:line="240" w:lineRule="auto"/>
       </w:pPr>
       <w:r>
         <w:rPr>
-          <w:rFonts w:ascii="Calibri" w:hAnsi="Calibri" w:eastAsia="Calibri"/>
           <w:b/>
           <w:color w:val="061A4F"/>
           <w:sz w:val="22"/>
         </w:rPr>
-        <w:t xml:space="preserve">â€¢ Centro de DistribuiÃ§Ã£o e LogÃ­stica: </w:t>
+        <w:t xml:space="preserve">Loja Online (Web E-Commerce B2B/B2C):</w:t>
       </w:r>
       <w:r>
         <w:rPr>
-          <w:rFonts w:ascii="Calibri" w:hAnsi="Calibri" w:eastAsia="Calibri"/>
-          <w:b w:val="0"/>
           <w:color w:val="333333"/>
           <w:sz w:val="22"/>
         </w:rPr>
-        <w:t xml:space="preserve">Agrupamento de pedidos por bairros, montagem de rotas, conferÃªncia de carga, despacho para veÃ­culos e app nativo do motorista com comprovaÃ§Ã£o digital e gestÃ£o de ocorrÃªncias.</w:t>
+        <w:t xml:space="preserve"> Canal digital de autoatendimento para clientes finais e corporativos em </w:t>
+      </w:r>
+      <w:r>
+        <w:rPr>
+          <w:rFonts w:ascii="Consolas" w:hAnsi="Consolas"/>
+          <w:color w:val="C7254E"/>
+          <w:shd w:val="clear" w:color="auto" w:fill="F9F2F4"/>
+          <w:sz w:val="20"/>
+        </w:rPr>
+        <w:t xml:space="preserve">https://xiquim-vargas-erp.onrender.com/loja.html</w:t>
+      </w:r>
+      <w:r>
+        <w:rPr>
+          <w:color w:val="333333"/>
+          <w:sz w:val="22"/>
+        </w:rPr>
+        <w:t xml:space="preserve">, com catálogo dinâmico de produtos, cálculo automático de frete por bairro, pedido mínimo parametrizável e auto-cadastro.</w:t>
       </w:r>
     </w:p>
     <w:p>
       <w:pPr>
         <w:pStyle w:val="ListBullet"/>
-        <w:spacing w:after="80" w:line="260" w:lineRule="auto"/>
+        <w:spacing w:after="60" w:line="240" w:lineRule="auto"/>
       </w:pPr>
       <w:r>
         <w:rPr>
-          <w:rFonts w:ascii="Calibri" w:hAnsi="Calibri" w:eastAsia="Calibri"/>
           <w:b/>
           <w:color w:val="061A4F"/>
           <w:sz w:val="22"/>
         </w:rPr>
-        <w:t xml:space="preserve">â€¢ Doca de Recebimento (Inbound): </w:t>
+        <w:t xml:space="preserve">Logística e Entregas (App Motorista):</w:t>
       </w:r>
       <w:r>
         <w:rPr>
-          <w:rFonts w:ascii="Calibri" w:hAnsi="Calibri" w:eastAsia="Calibri"/>
-          <w:b w:val="0"/>
           <w:color w:val="333333"/>
           <w:sz w:val="22"/>
         </w:rPr>
-        <w:t xml:space="preserve">GestÃ£o de compras de fornecedores, conferÃªncia fÃ­sica de entrada e alimentaÃ§Ã£o automÃ¡tica do estoque comercial.</w:t>
+        <w:t xml:space="preserve"> Aplicativo móvel nativo (</w:t>
       </w:r>
-    </w:p>
-    <w:p>
-      <w:pPr>
-        <w:spacing w:before="240" w:after="160"/>
-      </w:pPr>
       <w:r>
         <w:rPr>
-          <w:rFonts w:ascii="Calibri" w:hAnsi="Calibri" w:eastAsia="Calibri"/>
-          <w:b/>
-          <w:color w:val="061A4F"/>
-          <w:sz w:val="36"/>
+          <w:rFonts w:ascii="Consolas" w:hAnsi="Consolas"/>
+          <w:color w:val="C7254E"/>
+          <w:shd w:val="clear" w:color="auto" w:fill="F9F2F4"/>
+          <w:sz w:val="20"/>
         </w:rPr>
-        <w:t>2. SincronizaÃ§Ã£o em Tempo Real (Zero Reload)</w:t>
+        <w:t xml:space="preserve">XiquimVargas-Motorista-1.8.3.apk</w:t>
       </w:r>
-    </w:p>
-    <w:p>
-      <w:pPr>
-        <w:spacing w:after="120" w:line="276" w:lineRule="auto"/>
-      </w:pPr>
       <w:r>
         <w:rPr>
-          <w:rFonts w:ascii="Calibri" w:hAnsi="Calibri" w:eastAsia="Calibri"/>
-          <w:b w:val="0"/>
           <w:color w:val="333333"/>
           <w:sz w:val="22"/>
         </w:rPr>
-        <w:t xml:space="preserve">Um dos pilares tecnolÃ³gicos fundamentais do ERP AutonomIA Ã© a sincronizaÃ§Ã£o instantÃ¢nea de dados entre todas as interfaces conectadas, sem a necessidade de recarregar a pÃ¡gina (zero F5). Todas as alteraÃ§Ãµes operacionais refletem de imediato no navegador ou dispositivo de cada colaborador.</w:t>
+        <w:t xml:space="preserve"> ou </w:t>
       </w:r>
-    </w:p>
-    <w:p>
-      <w:pPr>
-        <w:spacing w:after="120" w:line="276" w:lineRule="auto"/>
-      </w:pPr>
       <w:r>
         <w:rPr>
-          <w:rFonts w:ascii="Calibri" w:hAnsi="Calibri" w:eastAsia="Calibri"/>
-          <w:b w:val="0"/>
+          <w:rFonts w:ascii="Consolas" w:hAnsi="Consolas"/>
+          <w:color w:val="C7254E"/>
+          <w:shd w:val="clear" w:color="auto" w:fill="F9F2F4"/>
+          <w:sz w:val="20"/>
+        </w:rPr>
+        <w:t xml:space="preserve">motorista.html</w:t>
+      </w:r>
+      <w:r>
+        <w:rPr>
           <w:color w:val="333333"/>
           <w:sz w:val="22"/>
         </w:rPr>
-        <w:t xml:space="preserve">A infraestrutura de tempo real opera sob uma arquitetura hÃ­brida de alta resiliÃªncia baseada em Server-Sent Events (SSE) e canais de mensageria local no navegador (BroadcastChannel):</w:t>
+        <w:t xml:space="preserve">) com listagem ordenada de rotas do dia, atalhos de discagem e WhatsApp em 1 clique para cada cliente, registro de comprovantes fotográficos e protocolo de insucesso de entrega com reversão automática.</w:t>
       </w:r>
     </w:p>
     <w:p>
       <w:pPr>
         <w:pStyle w:val="ListBullet"/>
-        <w:spacing w:after="80" w:line="260" w:lineRule="auto"/>
+        <w:spacing w:after="60" w:line="240" w:lineRule="auto"/>
       </w:pPr>
       <w:r>
         <w:rPr>
-          <w:rFonts w:ascii="Calibri" w:hAnsi="Calibri" w:eastAsia="Calibri"/>
           <w:b/>
           <w:color w:val="061A4F"/>
           <w:sz w:val="22"/>
         </w:rPr>
-        <w:t xml:space="preserve">â€¢ AtualizaÃ§Ã£o Visual sem Recarregamento: </w:t>
+        <w:t xml:space="preserve">Doca de Recebimento e Compras (Inbound):</w:t>
       </w:r>
       <w:r>
         <w:rPr>
-          <w:rFonts w:ascii="Calibri" w:hAnsi="Calibri" w:eastAsia="Calibri"/>
-          <w:b w:val="0"/>
           <w:color w:val="333333"/>
           <w:sz w:val="22"/>
         </w:rPr>
-        <w:t xml:space="preserve">Quando um novo pedido Ã© emitido pela loja ou vendedor, o Kanban de pedidos e os contadores da Torre de Controle se atualizam no mesmo instante, exibindo badges dinÃ¢micos e cards com realce visual temporÃ¡rio (efeito flash).</w:t>
+        <w:t xml:space="preserve"> Módulo de controle de fornecedores, emissão de pedidos de compra e conferência física com leitor de código de barras, alimentando automaticamente o estoque comercial e registrando o histórico de custos.</w:t>
       </w:r>
     </w:p>
     <w:p>
       <w:pPr>
-        <w:pStyle w:val="ListBullet"/>
-        <w:spacing w:after="80" w:line="260" w:lineRule="auto"/>
+        <w:pStyle w:val="Heading2"/>
+        <w:spacing w:before="220" w:after="100"/>
       </w:pPr>
       <w:r>
         <w:rPr>
-          <w:rFonts w:ascii="Calibri" w:hAnsi="Calibri" w:eastAsia="Calibri"/>
           <w:b/>
-          <w:color w:val="061A4F"/>
-          <w:sz w:val="22"/>
+          <w:color w:val="FD5E02"/>
+          <w:sz w:val="26"/>
         </w:rPr>
-        <w:t xml:space="preserve">â€¢ ConexÃ£o Persistente e Segura: </w:t>
-      </w:r>
-      <w:r>
-        <w:rPr>
-          <w:rFonts w:ascii="Calibri" w:hAnsi="Calibri" w:eastAsia="Calibri"/>
-          <w:b w:val="0"/>
-          <w:color w:val="333333"/>
-          <w:sz w:val="22"/>
-        </w:rPr>
-        <w:t xml:space="preserve">O cliente web estabelece um fluxo contÃ­nuo em /api/events autenticado por ticket temporÃ¡rio criptogrÃ¡fico, recebendo notificaÃ§Ãµes atÃ´micas de eventos de negÃ³cio (ORDER_CREATED, STOCK_UPDATED, LOGISTICS_UPDATE, RETURNED_ORDER_LOGGED).</w:t>
+        <w:t xml:space="preserve">2. SUÍTE DOS 4 APLICATIVOS ANDROID NATIVOS (100% OFFLINE)</w:t>
       </w:r>
     </w:p>
     <w:p>
       <w:pPr>
-        <w:pStyle w:val="ListBullet"/>
-        <w:spacing w:after="80" w:line="260" w:lineRule="auto"/>
+        <w:spacing w:after="120" w:line="260" w:lineRule="auto"/>
       </w:pPr>
       <w:r>
         <w:rPr>
-          <w:rFonts w:ascii="Calibri" w:hAnsi="Calibri" w:eastAsia="Calibri"/>
-          <w:b/>
-          <w:color w:val="061A4F"/>
+          <w:color w:val="333333"/>
           <w:sz w:val="22"/>
         </w:rPr>
-        <w:t xml:space="preserve">â€¢ SincronizaÃ§Ã£o Multi-Abas: </w:t>
+        <w:t xml:space="preserve">O ecossistema móvel conta com 4 aplicativos nativos desenvolvidos em Kotlin e compilados com Gradle 9.6.0 (AGP 9.4.1 / Java 17 LTS / API 26..35). Todos os APKs encontram-se disponíveis nas pastas </w:t>
       </w:r>
       <w:r>
         <w:rPr>
-          <w:rFonts w:ascii="Calibri" w:hAnsi="Calibri" w:eastAsia="Calibri"/>
-          <w:b w:val="0"/>
+          <w:rFonts w:ascii="Consolas" w:hAnsi="Consolas"/>
+          <w:color w:val="C7254E"/>
+          <w:shd w:val="clear" w:color="auto" w:fill="F9F2F4"/>
+          <w:sz w:val="20"/>
+        </w:rPr>
+        <w:t xml:space="preserve">/dist-apks/</w:t>
+      </w:r>
+      <w:r>
+        <w:rPr>
           <w:color w:val="333333"/>
           <w:sz w:val="22"/>
         </w:rPr>
-        <w:t xml:space="preserve">O canal local BroadcastChannel propaga as mutaÃ§Ãµes de dados entre todas as abas abertas pelo mesmo usuÃ¡rio na estaÃ§Ã£o de trabalho, garantindo consistÃªncia total com consumo mÃ­nimo de largura de banda.</w:t>
-      </w:r>
-    </w:p>
-    <w:p>
-      <w:pPr>
-        <w:pStyle w:val="ListBullet"/>
-        <w:spacing w:after="80" w:line="260" w:lineRule="auto"/>
-      </w:pPr>
-      <w:r>
-        <w:rPr>
-          <w:rFonts w:ascii="Calibri" w:hAnsi="Calibri" w:eastAsia="Calibri"/>
-          <w:b/>
-          <w:color w:val="061A4F"/>
-          <w:sz w:val="22"/>
-        </w:rPr>
-        <w:t xml:space="preserve">â€¢ ReconexÃ£o Resiliente AutomÃ¡tica: </w:t>
+        <w:t xml:space="preserve">, </w:t>
       </w:r>
       <w:r>
         <w:rPr>
-          <w:rFonts w:ascii="Calibri" w:hAnsi="Calibri" w:eastAsia="Calibri"/>
-          <w:b w:val="0"/>
+          <w:rFonts w:ascii="Consolas" w:hAnsi="Consolas"/>
+          <w:color w:val="C7254E"/>
+          <w:shd w:val="clear" w:color="auto" w:fill="F9F2F4"/>
+          <w:sz w:val="20"/>
+        </w:rPr>
+        <w:t xml:space="preserve">/mobile/apks/</w:t>
+      </w:r>
+      <w:r>
+        <w:rPr>
           <w:color w:val="333333"/>
           <w:sz w:val="22"/>
         </w:rPr>
-        <w:t xml:space="preserve">Em caso de oscilaÃ§Ãµes na conexÃ£o de rede local ou mÃ³vel, o subsistema de eventos executa reconexÃ£o com backoff exponencial e revalida o estado integral da tela assim que a conexÃ£o Ã© restabelecida.</w:t>
+        <w:t xml:space="preserve">, </w:t>
       </w:r>
-    </w:p>
-    <w:p>
-      <w:pPr>
-        <w:spacing w:before="240" w:after="160"/>
-      </w:pPr>
       <w:r>
         <w:rPr>
-          <w:rFonts w:ascii="Calibri" w:hAnsi="Calibri" w:eastAsia="Calibri"/>
-          <w:b/>
-          <w:color w:val="061A4F"/>
-          <w:sz w:val="36"/>
+          <w:rFonts w:ascii="Consolas" w:hAnsi="Consolas"/>
+          <w:color w:val="C7254E"/>
+          <w:shd w:val="clear" w:color="auto" w:fill="F9F2F4"/>
+          <w:sz w:val="20"/>
         </w:rPr>
-        <w:t>3. Ciclo de Vida do Pedido e GovernanÃ§a Transacional</w:t>
+        <w:t xml:space="preserve">/apks versao final/</w:t>
       </w:r>
-    </w:p>
-    <w:p>
-      <w:pPr>
-        <w:spacing w:after="120" w:line="276" w:lineRule="auto"/>
-      </w:pPr>
       <w:r>
         <w:rPr>
-          <w:rFonts w:ascii="Calibri" w:hAnsi="Calibri" w:eastAsia="Calibri"/>
-          <w:b w:val="0"/>
           <w:color w:val="333333"/>
           <w:sz w:val="22"/>
         </w:rPr>
-        <w:t xml:space="preserve">O ciclo de vida operacional de um pedido no ERP AutonomIA obedece a uma mÃ¡quina de estados estrita, executada sob transaÃ§Ãµes ACID no banco de dados para eliminar qualquer risco de concorrÃªncia ou venda de itens sem estoque.</w:t>
+        <w:t xml:space="preserve"> e na raiz do projeto:</w:t>
       </w:r>
     </w:p>
-    <w:tbl xmlns:w="http://schemas.openxmlformats.org/wordprocessingml/2006/main">
+    <w:tbl>
       <w:tblPr>
         <w:tblStyle w:val="TableGrid"/>
-        <w:tblW w:type="auto" w:w="0"/>
-        <w:tblLook w:firstColumn="1" w:firstRow="1" w:lastColumn="0" w:lastRow="0" w:noHBand="0" w:noVBand="1" w:val="04A0"/>
+        <w:tblW w:w="0" w:type="auto"/>
+        <w:tblLook w:val="04A0"/>
       </w:tblPr>
-      <w:tblGrid>
-        <w:gridCol w:w="2000"/>
-        <w:gridCol w:w="2700"/>
-        <w:gridCol w:w="2600"/>
-        <w:gridCol w:w="2672"/>
-      </w:tblGrid>
       <w:tr>
         <w:tc>
           <w:tcPr>
-            <w:tcW w:type="dxa" w:w="2000"/>
-            <w:shd w:fill="0B3D91"/>
+            <w:shd w:val="clear" w:color="auto" w:fill="061A4F"/>
+            <w:tcMar>
+              <w:top w:w="120" w:type="dxa"/>
+              <w:bottom w:w="120" w:type="dxa"/>
+              <w:left w:w="160" w:type="dxa"/>
+              <w:right w:w="160" w:type="dxa"/>
+            </w:tcMar>
           </w:tcPr>
           <w:p>
             <w:pPr>
-              <w:spacing w:before="60" w:after="60"/>
+              <w:spacing w:after="40" w:line="240" w:lineRule="auto"/>
             </w:pPr>
             <w:r>
               <w:rPr>
-                <w:rFonts w:ascii="Calibri" w:hAnsi="Calibri" w:eastAsia="Calibri"/>
                 <w:b/>
                 <w:color w:val="FFFFFF"/>
                 <w:sz w:val="20"/>
               </w:rPr>
-              <w:t>Status</w:t>
+              <w:t xml:space="preserve">Aplicativo APK</w:t>
             </w:r>
           </w:p>
         </w:tc>
         <w:tc>
           <w:tcPr>
-            <w:tcW w:type="dxa" w:w="2700"/>
-            <w:shd w:fill="0B3D91"/>
+            <w:shd w:val="clear" w:color="auto" w:fill="061A4F"/>
+            <w:tcMar>
+              <w:top w:w="120" w:type="dxa"/>
+              <w:bottom w:w="120" w:type="dxa"/>
+              <w:left w:w="160" w:type="dxa"/>
+              <w:right w:w="160" w:type="dxa"/>
+            </w:tcMar>
           </w:tcPr>
           <w:p>
             <w:pPr>
-              <w:spacing w:before="60" w:after="60"/>
+              <w:spacing w:after="40" w:line="240" w:lineRule="auto"/>
             </w:pPr>
             <w:r>
               <w:rPr>
-                <w:rFonts w:ascii="Calibri" w:hAnsi="Calibri" w:eastAsia="Calibri"/>
                 <w:b/>
                 <w:color w:val="FFFFFF"/>
                 <w:sz w:val="20"/>
               </w:rPr>
-              <w:t>Gatilho de TransiÃ§Ã£o</w:t>
+              <w:t xml:space="preserve">Perfil Operacional</w:t>
             </w:r>
           </w:p>
         </w:tc>
         <w:tc>
           <w:tcPr>
-            <w:tcW w:type="dxa" w:w="2600"/>
-            <w:shd w:fill="0B3D91"/>
+            <w:shd w:val="clear" w:color="auto" w:fill="061A4F"/>
+            <w:tcMar>
+              <w:top w:w="120" w:type="dxa"/>
+              <w:bottom w:w="120" w:type="dxa"/>
+              <w:left w:w="160" w:type="dxa"/>
+              <w:right w:w="160" w:type="dxa"/>
+            </w:tcMar>
           </w:tcPr>
           <w:p>
             <w:pPr>
-              <w:spacing w:before="60" w:after="60"/>
+              <w:spacing w:after="40" w:line="240" w:lineRule="auto"/>
             </w:pPr>
             <w:r>
               <w:rPr>
-                <w:rFonts w:ascii="Calibri" w:hAnsi="Calibri" w:eastAsia="Calibri"/>
                 <w:b/>
                 <w:color w:val="FFFFFF"/>
                 <w:sz w:val="20"/>
               </w:rPr>
-              <w:t>Impacto em Estoque</w:t>
-            </w:r>
-          </w:p>
-        </w:tc>
-        <w:tc>
-          <w:tcPr>
-            <w:tcW w:type="dxa" w:w="2672"/>
-            <w:shd w:fill="0B3D91"/>
-          </w:tcPr>
-          <w:p>
-            <w:pPr>
-              <w:spacing w:before="60" w:after="60"/>
-            </w:pPr>
-            <w:r>
-              <w:rPr>
-                <w:rFonts w:ascii="Calibri" w:hAnsi="Calibri" w:eastAsia="Calibri"/>
-                <w:b/>
-                <w:color w:val="FFFFFF"/>
-                <w:sz w:val="20"/>
-              </w:rPr>
-              <w:t>AÃ§Ã£o Operacional</w:t>
+              <w:t xml:space="preserve">Destaques Técnicos e Funcionalidades</w:t>
             </w:r>
           </w:p>
         </w:tc>
@@ -606,81 +699,70 @@
       <w:tr>
         <w:tc>
           <w:tcPr>
-            <w:tcW w:type="dxa" w:w="2000"/>
+            <w:shd w:val="clear" w:color="auto" w:fill="F8F9FA"/>
+            <w:tcMar>
+              <w:top w:w="120" w:type="dxa"/>
+              <w:bottom w:w="120" w:type="dxa"/>
+              <w:left w:w="160" w:type="dxa"/>
+              <w:right w:w="160" w:type="dxa"/>
+            </w:tcMar>
           </w:tcPr>
           <w:p>
             <w:pPr>
-              <w:spacing w:before="40" w:after="40"/>
-              <w:line w:line="240" w:lineRule="auto"/>
+              <w:spacing w:after="40" w:line="240" w:lineRule="auto"/>
             </w:pPr>
             <w:r>
               <w:rPr>
-                <w:rFonts w:ascii="Calibri" w:hAnsi="Calibri" w:eastAsia="Calibri"/>
-                <w:b w:val="0"/>
                 <w:color w:val="333333"/>
-                <w:sz w:val="18"/>
+                <w:sz w:val="19"/>
               </w:rPr>
-              <w:t xml:space="preserve">PENDENTE</w:t>
+              <w:t xml:space="preserve">XiquimVargas-Vendedor-1.8.3.apk</w:t>
             </w:r>
           </w:p>
         </w:tc>
         <w:tc>
           <w:tcPr>
-            <w:tcW w:type="dxa" w:w="2700"/>
+            <w:shd w:val="clear" w:color="auto" w:fill="F8F9FA"/>
+            <w:tcMar>
+              <w:top w:w="120" w:type="dxa"/>
+              <w:bottom w:w="120" w:type="dxa"/>
+              <w:left w:w="160" w:type="dxa"/>
+              <w:right w:w="160" w:type="dxa"/>
+            </w:tcMar>
           </w:tcPr>
           <w:p>
             <w:pPr>
-              <w:spacing w:before="40" w:after="40"/>
-              <w:line w:line="240" w:lineRule="auto"/>
+              <w:spacing w:after="40" w:line="240" w:lineRule="auto"/>
             </w:pPr>
             <w:r>
               <w:rPr>
-                <w:rFonts w:ascii="Calibri" w:hAnsi="Calibri" w:eastAsia="Calibri"/>
-                <w:b w:val="0"/>
                 <w:color w:val="333333"/>
-                <w:sz w:val="18"/>
+                <w:sz w:val="19"/>
               </w:rPr>
-              <w:t xml:space="preserve">Pedido criado na Loja Online ou App do Vendedor.</w:t>
+              <w:t xml:space="preserve">Vendedor Externo / Representante</w:t>
             </w:r>
           </w:p>
         </w:tc>
         <w:tc>
           <w:tcPr>
-            <w:tcW w:type="dxa" w:w="2600"/>
+            <w:shd w:val="clear" w:color="auto" w:fill="F8F9FA"/>
+            <w:tcMar>
+              <w:top w:w="120" w:type="dxa"/>
+              <w:bottom w:w="120" w:type="dxa"/>
+              <w:left w:w="160" w:type="dxa"/>
+              <w:right w:w="160" w:type="dxa"/>
+            </w:tcMar>
           </w:tcPr>
           <w:p>
             <w:pPr>
-              <w:spacing w:before="40" w:after="40"/>
-              <w:line w:line="240" w:lineRule="auto"/>
+              <w:spacing w:after="40" w:line="240" w:lineRule="auto"/>
             </w:pPr>
             <w:r>
               <w:rPr>
-                <w:rFonts w:ascii="Calibri" w:hAnsi="Calibri" w:eastAsia="Calibri"/>
-                <w:b w:val="0"/>
                 <w:color w:val="333333"/>
-                <w:sz w:val="18"/>
+                <w:sz w:val="19"/>
               </w:rPr>
-              <w:t xml:space="preserve">Estoque reservado de imediato pelo servidor.</w:t>
-            </w:r>
-          </w:p>
-        </w:tc>
-        <w:tc>
-          <w:tcPr>
-            <w:tcW w:type="dxa" w:w="2672"/>
-          </w:tcPr>
-          <w:p>
-            <w:pPr>
-              <w:spacing w:before="40" w:after="40"/>
-              <w:line w:line="240" w:lineRule="auto"/>
-            </w:pPr>
-            <w:r>
-              <w:rPr>
-                <w:rFonts w:ascii="Calibri" w:hAnsi="Calibri" w:eastAsia="Calibri"/>
-                <w:b w:val="0"/>
-                <w:color w:val="333333"/>
-                <w:sz w:val="18"/>
-              </w:rPr>
-              <w:t xml:space="preserve">Revisar dados cadastrais e avanÃ§ar para separaÃ§Ã£o.</w:t>
+              <w:t xml:space="preserve">100% Offline; abertura em ~0.05s sem sinal; catálogo de 620 produtos; emissão de pedidos em fila local (IndexedDB); subtítulos no tom oficial Laranja (#FD5E02).</w:t>
             </w:r>
           </w:p>
         </w:tc>
@@ -688,85 +770,70 @@
       <w:tr>
         <w:tc>
           <w:tcPr>
-            <w:tcW w:type="dxa" w:w="2000"/>
-            <w:shd w:fill="F0F4F8"/>
+            <w:shd w:val="clear" w:color="auto" w:fill="F8F9FA"/>
+            <w:tcMar>
+              <w:top w:w="120" w:type="dxa"/>
+              <w:bottom w:w="120" w:type="dxa"/>
+              <w:left w:w="160" w:type="dxa"/>
+              <w:right w:w="160" w:type="dxa"/>
+            </w:tcMar>
           </w:tcPr>
           <w:p>
             <w:pPr>
-              <w:spacing w:before="40" w:after="40"/>
-              <w:line w:line="240" w:lineRule="auto"/>
+              <w:spacing w:after="40" w:line="240" w:lineRule="auto"/>
             </w:pPr>
             <w:r>
               <w:rPr>
-                <w:rFonts w:ascii="Calibri" w:hAnsi="Calibri" w:eastAsia="Calibri"/>
-                <w:b w:val="0"/>
                 <w:color w:val="333333"/>
-                <w:sz w:val="18"/>
+                <w:sz w:val="19"/>
               </w:rPr>
-              <w:t xml:space="preserve">SEPARACAO</w:t>
+              <w:t xml:space="preserve">XiquimVargas-Motorista-1.8.3.apk</w:t>
             </w:r>
           </w:p>
         </w:tc>
         <w:tc>
           <w:tcPr>
-            <w:tcW w:type="dxa" w:w="2700"/>
-            <w:shd w:fill="F0F4F8"/>
+            <w:shd w:val="clear" w:color="auto" w:fill="F8F9FA"/>
+            <w:tcMar>
+              <w:top w:w="120" w:type="dxa"/>
+              <w:bottom w:w="120" w:type="dxa"/>
+              <w:left w:w="160" w:type="dxa"/>
+              <w:right w:w="160" w:type="dxa"/>
+            </w:tcMar>
           </w:tcPr>
           <w:p>
             <w:pPr>
-              <w:spacing w:before="40" w:after="40"/>
-              <w:line w:line="240" w:lineRule="auto"/>
+              <w:spacing w:after="40" w:line="240" w:lineRule="auto"/>
             </w:pPr>
             <w:r>
               <w:rPr>
-                <w:rFonts w:ascii="Calibri" w:hAnsi="Calibri" w:eastAsia="Calibri"/>
-                <w:b w:val="0"/>
                 <w:color w:val="333333"/>
-                <w:sz w:val="18"/>
+                <w:sz w:val="19"/>
               </w:rPr>
-              <w:t xml:space="preserve">Operador inicia a separaÃ§Ã£o na Torre de Controle.</w:t>
+              <w:t xml:space="preserve">Motorista / Entregador</w:t>
             </w:r>
           </w:p>
         </w:tc>
         <w:tc>
           <w:tcPr>
-            <w:tcW w:type="dxa" w:w="2600"/>
-            <w:shd w:fill="F0F4F8"/>
+            <w:shd w:val="clear" w:color="auto" w:fill="F8F9FA"/>
+            <w:tcMar>
+              <w:top w:w="120" w:type="dxa"/>
+              <w:bottom w:w="120" w:type="dxa"/>
+              <w:left w:w="160" w:type="dxa"/>
+              <w:right w:w="160" w:type="dxa"/>
+            </w:tcMar>
           </w:tcPr>
           <w:p>
             <w:pPr>
-              <w:spacing w:before="40" w:after="40"/>
-              <w:line w:line="240" w:lineRule="auto"/>
+              <w:spacing w:after="40" w:line="240" w:lineRule="auto"/>
             </w:pPr>
             <w:r>
               <w:rPr>
-                <w:rFonts w:ascii="Calibri" w:hAnsi="Calibri" w:eastAsia="Calibri"/>
-                <w:b w:val="0"/>
                 <w:color w:val="333333"/>
-                <w:sz w:val="18"/>
+                <w:sz w:val="19"/>
               </w:rPr>
-              <w:t xml:space="preserve">Saldo continua reservado fisicamente.</w:t>
-            </w:r>
-          </w:p>
-        </w:tc>
-        <w:tc>
-          <w:tcPr>
-            <w:tcW w:type="dxa" w:w="2672"/>
-            <w:shd w:fill="F0F4F8"/>
-          </w:tcPr>
-          <w:p>
-            <w:pPr>
-              <w:spacing w:before="40" w:after="40"/>
-              <w:line w:line="240" w:lineRule="auto"/>
-            </w:pPr>
-            <w:r>
-              <w:rPr>
-                <w:rFonts w:ascii="Calibri" w:hAnsi="Calibri" w:eastAsia="Calibri"/>
-                <w:b w:val="0"/>
-                <w:color w:val="333333"/>
-                <w:sz w:val="18"/>
-              </w:rPr>
-              <w:t xml:space="preserve">Imprimir romaneio e coletar itens no estoque.</w:t>
+              <w:t xml:space="preserve">100% Offline; roteirização viária; botões de contato direto (WhatsApp/Ligação); captura de fotos de comprovante; protocolo de retorno com reversão automática.</w:t>
             </w:r>
           </w:p>
         </w:tc>
@@ -774,81 +841,70 @@
       <w:tr>
         <w:tc>
           <w:tcPr>
-            <w:tcW w:type="dxa" w:w="2000"/>
+            <w:shd w:val="clear" w:color="auto" w:fill="F8F9FA"/>
+            <w:tcMar>
+              <w:top w:w="120" w:type="dxa"/>
+              <w:bottom w:w="120" w:type="dxa"/>
+              <w:left w:w="160" w:type="dxa"/>
+              <w:right w:w="160" w:type="dxa"/>
+            </w:tcMar>
           </w:tcPr>
           <w:p>
             <w:pPr>
-              <w:spacing w:before="40" w:after="40"/>
-              <w:line w:line="240" w:lineRule="auto"/>
+              <w:spacing w:after="40" w:line="240" w:lineRule="auto"/>
             </w:pPr>
             <w:r>
               <w:rPr>
-                <w:rFonts w:ascii="Calibri" w:hAnsi="Calibri" w:eastAsia="Calibri"/>
-                <w:b w:val="0"/>
                 <w:color w:val="333333"/>
-                <w:sz w:val="18"/>
+                <w:sz w:val="19"/>
               </w:rPr>
-              <w:t xml:space="preserve">ROTA</w:t>
+              <w:t xml:space="preserve">XiquimVargas-PDV-1.8.3.apk *(ou Caixa)*</w:t>
             </w:r>
           </w:p>
         </w:tc>
         <w:tc>
           <w:tcPr>
-            <w:tcW w:type="dxa" w:w="2700"/>
+            <w:shd w:val="clear" w:color="auto" w:fill="F8F9FA"/>
+            <w:tcMar>
+              <w:top w:w="120" w:type="dxa"/>
+              <w:bottom w:w="120" w:type="dxa"/>
+              <w:left w:w="160" w:type="dxa"/>
+              <w:right w:w="160" w:type="dxa"/>
+            </w:tcMar>
           </w:tcPr>
           <w:p>
             <w:pPr>
-              <w:spacing w:before="40" w:after="40"/>
-              <w:line w:line="240" w:lineRule="auto"/>
+              <w:spacing w:after="40" w:line="240" w:lineRule="auto"/>
             </w:pPr>
             <w:r>
               <w:rPr>
-                <w:rFonts w:ascii="Calibri" w:hAnsi="Calibri" w:eastAsia="Calibri"/>
-                <w:b w:val="0"/>
                 <w:color w:val="333333"/>
-                <w:sz w:val="18"/>
+                <w:sz w:val="19"/>
               </w:rPr>
-              <w:t xml:space="preserve">ExpediÃ§Ã£o vincula o pedido a uma rota de motorista.</w:t>
+              <w:t xml:space="preserve">Operador de Caixa / Frente de Loja</w:t>
             </w:r>
           </w:p>
         </w:tc>
         <w:tc>
           <w:tcPr>
-            <w:tcW w:type="dxa" w:w="2600"/>
+            <w:shd w:val="clear" w:color="auto" w:fill="F8F9FA"/>
+            <w:tcMar>
+              <w:top w:w="120" w:type="dxa"/>
+              <w:bottom w:w="120" w:type="dxa"/>
+              <w:left w:w="160" w:type="dxa"/>
+              <w:right w:w="160" w:type="dxa"/>
+            </w:tcMar>
           </w:tcPr>
           <w:p>
             <w:pPr>
-              <w:spacing w:before="40" w:after="40"/>
-              <w:line w:line="240" w:lineRule="auto"/>
+              <w:spacing w:after="40" w:line="240" w:lineRule="auto"/>
             </w:pPr>
             <w:r>
               <w:rPr>
-                <w:rFonts w:ascii="Calibri" w:hAnsi="Calibri" w:eastAsia="Calibri"/>
-                <w:b w:val="0"/>
                 <w:color w:val="333333"/>
-                <w:sz w:val="18"/>
+                <w:sz w:val="19"/>
               </w:rPr>
-              <w:t xml:space="preserve">Saldo em trÃ¢nsito com o motorista.</w:t>
-            </w:r>
-          </w:p>
-        </w:tc>
-        <w:tc>
-          <w:tcPr>
-            <w:tcW w:type="dxa" w:w="2672"/>
-          </w:tcPr>
-          <w:p>
-            <w:pPr>
-              <w:spacing w:before="40" w:after="40"/>
-              <w:line w:line="240" w:lineRule="auto"/>
-            </w:pPr>
-            <w:r>
-              <w:rPr>
-                <w:rFonts w:ascii="Calibri" w:hAnsi="Calibri" w:eastAsia="Calibri"/>
-                <w:b w:val="0"/>
-                <w:color w:val="333333"/>
-                <w:sz w:val="18"/>
-              </w:rPr>
-              <w:t xml:space="preserve">Carregar veÃ­culo e iniciar entregas.</w:t>
+              <w:t xml:space="preserve">100% Offline; leitor de código de barras; venda expressa de balcão; comprovante térmico; múltiplos meios de pagamento; cliente padrão CLIENTE-BALCAO.</w:t>
             </w:r>
           </w:p>
         </w:tc>
@@ -856,167 +912,70 @@
       <w:tr>
         <w:tc>
           <w:tcPr>
-            <w:tcW w:type="dxa" w:w="2000"/>
-            <w:shd w:fill="F0F4F8"/>
+            <w:shd w:val="clear" w:color="auto" w:fill="F8F9FA"/>
+            <w:tcMar>
+              <w:top w:w="120" w:type="dxa"/>
+              <w:bottom w:w="120" w:type="dxa"/>
+              <w:left w:w="160" w:type="dxa"/>
+              <w:right w:w="160" w:type="dxa"/>
+            </w:tcMar>
           </w:tcPr>
           <w:p>
             <w:pPr>
-              <w:spacing w:before="40" w:after="40"/>
-              <w:line w:line="240" w:lineRule="auto"/>
+              <w:spacing w:after="40" w:line="240" w:lineRule="auto"/>
             </w:pPr>
             <w:r>
               <w:rPr>
-                <w:rFonts w:ascii="Calibri" w:hAnsi="Calibri" w:eastAsia="Calibri"/>
-                <w:b w:val="0"/>
                 <w:color w:val="333333"/>
-                <w:sz w:val="18"/>
+                <w:sz w:val="19"/>
               </w:rPr>
-              <w:t xml:space="preserve">CONCLUIDO</w:t>
+              <w:t xml:space="preserve">XiquimVargas-TorreControle-1.8.3.apk</w:t>
             </w:r>
           </w:p>
         </w:tc>
         <w:tc>
           <w:tcPr>
-            <w:tcW w:type="dxa" w:w="2700"/>
-            <w:shd w:fill="F0F4F8"/>
+            <w:shd w:val="clear" w:color="auto" w:fill="F8F9FA"/>
+            <w:tcMar>
+              <w:top w:w="120" w:type="dxa"/>
+              <w:bottom w:w="120" w:type="dxa"/>
+              <w:left w:w="160" w:type="dxa"/>
+              <w:right w:w="160" w:type="dxa"/>
+            </w:tcMar>
           </w:tcPr>
           <w:p>
             <w:pPr>
-              <w:spacing w:before="40" w:after="40"/>
-              <w:line w:line="240" w:lineRule="auto"/>
+              <w:spacing w:after="40" w:line="240" w:lineRule="auto"/>
             </w:pPr>
             <w:r>
               <w:rPr>
-                <w:rFonts w:ascii="Calibri" w:hAnsi="Calibri" w:eastAsia="Calibri"/>
-                <w:b w:val="0"/>
                 <w:color w:val="333333"/>
-                <w:sz w:val="18"/>
+                <w:sz w:val="19"/>
               </w:rPr>
-              <w:t xml:space="preserve">Motorista registra entrega e comprovante no app.</w:t>
+              <w:t xml:space="preserve">Gestor Geral / Expedição / Fiscal</w:t>
             </w:r>
           </w:p>
         </w:tc>
         <w:tc>
           <w:tcPr>
-            <w:tcW w:type="dxa" w:w="2600"/>
-            <w:shd w:fill="F0F4F8"/>
+            <w:shd w:val="clear" w:color="auto" w:fill="F8F9FA"/>
+            <w:tcMar>
+              <w:top w:w="120" w:type="dxa"/>
+              <w:bottom w:w="120" w:type="dxa"/>
+              <w:left w:w="160" w:type="dxa"/>
+              <w:right w:w="160" w:type="dxa"/>
+            </w:tcMar>
           </w:tcPr>
           <w:p>
             <w:pPr>
-              <w:spacing w:before="40" w:after="40"/>
-              <w:line w:line="240" w:lineRule="auto"/>
+              <w:spacing w:after="40" w:line="240" w:lineRule="auto"/>
             </w:pPr>
             <w:r>
               <w:rPr>
-                <w:rFonts w:ascii="Calibri" w:hAnsi="Calibri" w:eastAsia="Calibri"/>
-                <w:b w:val="0"/>
                 <w:color w:val="333333"/>
-                <w:sz w:val="18"/>
+                <w:sz w:val="19"/>
               </w:rPr>
-              <w:t xml:space="preserve">Baixa contÃ¡bil definitiva de estoque.</w:t>
-            </w:r>
-          </w:p>
-        </w:tc>
-        <w:tc>
-          <w:tcPr>
-            <w:tcW w:type="dxa" w:w="2672"/>
-            <w:shd w:fill="F0F4F8"/>
-          </w:tcPr>
-          <w:p>
-            <w:pPr>
-              <w:spacing w:before="40" w:after="40"/>
-              <w:line w:line="240" w:lineRule="auto"/>
-            </w:pPr>
-            <w:r>
-              <w:rPr>
-                <w:rFonts w:ascii="Calibri" w:hAnsi="Calibri" w:eastAsia="Calibri"/>
-                <w:b w:val="0"/>
-                <w:color w:val="333333"/>
-                <w:sz w:val="18"/>
-              </w:rPr>
-              <w:t xml:space="preserve">Pedido arquivado com assinatura e foto anexada.</w:t>
-            </w:r>
-          </w:p>
-        </w:tc>
-      </w:tr>
-      <w:tr>
-        <w:tc>
-          <w:tcPr>
-            <w:tcW w:type="dxa" w:w="2000"/>
-          </w:tcPr>
-          <w:p>
-            <w:pPr>
-              <w:spacing w:before="40" w:after="40"/>
-              <w:line w:line="240" w:lineRule="auto"/>
-            </w:pPr>
-            <w:r>
-              <w:rPr>
-                <w:rFonts w:ascii="Calibri" w:hAnsi="Calibri" w:eastAsia="Calibri"/>
-                <w:b w:val="0"/>
-                <w:color w:val="333333"/>
-                <w:sz w:val="18"/>
-              </w:rPr>
-              <w:t xml:space="preserve">RETORNADO</w:t>
-            </w:r>
-          </w:p>
-        </w:tc>
-        <w:tc>
-          <w:tcPr>
-            <w:tcW w:type="dxa" w:w="2700"/>
-          </w:tcPr>
-          <w:p>
-            <w:pPr>
-              <w:spacing w:before="40" w:after="40"/>
-              <w:line w:line="240" w:lineRule="auto"/>
-            </w:pPr>
-            <w:r>
-              <w:rPr>
-                <w:rFonts w:ascii="Calibri" w:hAnsi="Calibri" w:eastAsia="Calibri"/>
-                <w:b w:val="0"/>
-                <w:color w:val="333333"/>
-                <w:sz w:val="18"/>
-              </w:rPr>
-              <w:t xml:space="preserve">Insucesso na entrega marcado no app do motorista.</w:t>
-            </w:r>
-          </w:p>
-        </w:tc>
-        <w:tc>
-          <w:tcPr>
-            <w:tcW w:type="dxa" w:w="2600"/>
-          </w:tcPr>
-          <w:p>
-            <w:pPr>
-              <w:spacing w:before="40" w:after="40"/>
-              <w:line w:line="240" w:lineRule="auto"/>
-            </w:pPr>
-            <w:r>
-              <w:rPr>
-                <w:rFonts w:ascii="Calibri" w:hAnsi="Calibri" w:eastAsia="Calibri"/>
-                <w:b w:val="0"/>
-                <w:color w:val="333333"/>
-                <w:sz w:val="18"/>
-              </w:rPr>
-              <w:t xml:space="preserve">Reserva mantida; pedido volta para separaÃ§Ã£o.</w:t>
-            </w:r>
-          </w:p>
-        </w:tc>
-        <w:tc>
-          <w:tcPr>
-            <w:tcW w:type="dxa" w:w="2672"/>
-          </w:tcPr>
-          <w:p>
-            <w:pPr>
-              <w:spacing w:before="40" w:after="40"/>
-              <w:line w:line="240" w:lineRule="auto"/>
-            </w:pPr>
-            <w:r>
-              <w:rPr>
-                <w:rFonts w:ascii="Calibri" w:hAnsi="Calibri" w:eastAsia="Calibri"/>
-                <w:b w:val="0"/>
-                <w:color w:val="333333"/>
-                <w:sz w:val="18"/>
-              </w:rPr>
-              <w:t xml:space="preserve">Triagem no Painel de Retornados e reatribuiÃ§Ã£o de rota.</w:t>
+              <w:t xml:space="preserve">Visão completa da operação; painel de pedidos retornados; gestão de estoque; liberação de cargas; relatórios executivos e IA Administrativa.</w:t>
             </w:r>
           </w:p>
         </w:tc>
@@ -1024,1126 +983,1842 @@
     </w:tbl>
     <w:p>
       <w:pPr>
-        <w:spacing w:after="120" w:line="276" w:lineRule="auto"/>
+        <w:spacing w:after="120"/>
+      </w:pPr>
+    </w:p>
+    <w:p>
+      <w:pPr>
+        <w:pStyle w:val="Heading3"/>
+        <w:spacing w:before="180" w:after="80"/>
       </w:pPr>
       <w:r>
         <w:rPr>
-          <w:rFonts w:ascii="Calibri" w:hAnsi="Calibri" w:eastAsia="Calibri"/>
-          <w:b w:val="0"/>
-          <w:color w:val="333333"/>
+          <w:b/>
+          <w:color w:val="061A4F"/>
           <w:sz w:val="22"/>
         </w:rPr>
-        <w:t xml:space="preserve">Garantia de PreÃ§o Autoritativo: O cÃ¡lculo de preÃ§os de itens, descontos e tributos Ã© executado exclusivamente no backend. Mesmo que o cliente ou vendedor tente manipular requisiÃ§Ãµes no front-end, o servidor valida todas as regras e recusa divergÃªncias.</w:t>
+        <w:t xml:space="preserve">2.1 Arquitetura de Abertura 100% Offline e Fallback Automático</w:t>
       </w:r>
     </w:p>
     <w:p>
       <w:pPr>
-        <w:spacing w:before="240" w:after="160"/>
+        <w:spacing w:after="120" w:line="260" w:lineRule="auto"/>
       </w:pPr>
       <w:r>
         <w:rPr>
-          <w:rFonts w:ascii="Calibri" w:hAnsi="Calibri" w:eastAsia="Calibri"/>
-          <w:b/>
-          <w:color w:val="061A4F"/>
-          <w:sz w:val="36"/>
+          <w:color w:val="333333"/>
+          <w:sz w:val="22"/>
         </w:rPr>
-        <w:t>4. Torre de Controle (Painel de GestÃ£o Central)</w:t>
+        <w:t xml:space="preserve">Diferente de aplicativos híbridos convencionais que exibem a tela de erro </w:t>
+      </w:r>
+      <w:r>
+        <w:rPr>
+          <w:rFonts w:ascii="Consolas" w:hAnsi="Consolas"/>
+          <w:color w:val="C7254E"/>
+          <w:shd w:val="clear" w:color="auto" w:fill="F9F2F4"/>
+          <w:sz w:val="20"/>
+        </w:rPr>
+        <w:t xml:space="preserve">ERR_NAME_NOT_RESOLVED</w:t>
+      </w:r>
+      <w:r>
+        <w:rPr>
+          <w:color w:val="333333"/>
+          <w:sz w:val="22"/>
+        </w:rPr>
+        <w:t xml:space="preserve"> na ausência de sinal, os 4 APKs utilizam o mecanismo </w:t>
+      </w:r>
+      <w:r>
+        <w:rPr>
+          <w:rFonts w:ascii="Consolas" w:hAnsi="Consolas"/>
+          <w:color w:val="C7254E"/>
+          <w:shd w:val="clear" w:color="auto" w:fill="F9F2F4"/>
+          <w:sz w:val="20"/>
+        </w:rPr>
+        <w:t xml:space="preserve">WebViewAssetLoader</w:t>
+      </w:r>
+      <w:r>
+        <w:rPr>
+          <w:color w:val="333333"/>
+          <w:sz w:val="22"/>
+        </w:rPr>
+        <w:t xml:space="preserve"> com interceptação no </w:t>
+      </w:r>
+      <w:r>
+        <w:rPr>
+          <w:rFonts w:ascii="Consolas" w:hAnsi="Consolas"/>
+          <w:color w:val="C7254E"/>
+          <w:shd w:val="clear" w:color="auto" w:fill="F9F2F4"/>
+          <w:sz w:val="20"/>
+        </w:rPr>
+        <w:t xml:space="preserve">MainActivity.kt</w:t>
+      </w:r>
+      <w:r>
+        <w:rPr>
+          <w:color w:val="333333"/>
+          <w:sz w:val="22"/>
+        </w:rPr>
+        <w:t xml:space="preserve">:</w:t>
       </w:r>
     </w:p>
     <w:p>
       <w:pPr>
-        <w:spacing w:after="120" w:line="276" w:lineRule="auto"/>
+        <w:spacing w:after="60" w:line="240" w:lineRule="auto"/>
       </w:pPr>
       <w:r>
         <w:rPr>
-          <w:rFonts w:ascii="Calibri" w:hAnsi="Calibri" w:eastAsia="Calibri"/>
-          <w:b w:val="0"/>
-          <w:color w:val="333333"/>
-          <w:sz w:val="22"/>
-        </w:rPr>
-        <w:t xml:space="preserve">A Torre de Controle Ã© o centro de comando administrativo e operacional da empresa, reunindo em interface Ãºnica todos os mÃ³dulos necessÃ¡rios para o monitoramento e tomada de decisÃ£o estratÃ©gica.</w:t>
-      </w:r>
-    </w:p>
-    <w:p>
-      <w:pPr>
-        <w:spacing w:before="160" w:after="80"/>
-      </w:pPr>
-      <w:r>
-        <w:rPr>
-          <w:rFonts w:ascii="Calibri" w:hAnsi="Calibri" w:eastAsia="Calibri"/>
           <w:b/>
-          <w:color w:val="0B3D91"/>
-          <w:sz w:val="24"/>
-        </w:rPr>
-        <w:t>4.1 VisÃ£o Geral e Indicadores Executivos em Tempo Real</w:t>
-      </w:r>
-    </w:p>
-    <w:p>
-      <w:pPr>
-        <w:spacing w:after="120" w:line="276" w:lineRule="auto"/>
-      </w:pPr>
-      <w:r>
-        <w:rPr>
-          <w:rFonts w:ascii="Calibri" w:hAnsi="Calibri" w:eastAsia="Calibri"/>
-          <w:b w:val="0"/>
-          <w:color w:val="333333"/>
-          <w:sz w:val="22"/>
-        </w:rPr>
-        <w:t xml:space="preserve">O painel inicial consolida os KPIs vitais da operaÃ§Ã£o com atualizaÃ§Ã£o automÃ¡tica em tempo real: volume financeiro faturado no dia, ticket mÃ©dio por pedido, quantidade de pedidos em cada etapa do funil (Pendente, SeparaÃ§Ã£o, Rota, ConcluÃ­do e Retornados), alertas de ruptura de estoque e ranking de produtos mais vendidos.</w:t>
-      </w:r>
-    </w:p>
-    <w:p>
-      <w:pPr>
-        <w:spacing w:before="160" w:after="80"/>
-      </w:pPr>
-      <w:r>
-        <w:rPr>
-          <w:rFonts w:ascii="Calibri" w:hAnsi="Calibri" w:eastAsia="Calibri"/>
-          <w:b/>
-          <w:color w:val="0B3D91"/>
-          <w:sz w:val="24"/>
-        </w:rPr>
-        <w:t>4.2 CatÃ¡logo de Produtos e Categorias</w:t>
-      </w:r>
-    </w:p>
-    <w:p>
-      <w:pPr>
-        <w:spacing w:after="120" w:line="276" w:lineRule="auto"/>
-      </w:pPr>
-      <w:r>
-        <w:rPr>
-          <w:rFonts w:ascii="Calibri" w:hAnsi="Calibri" w:eastAsia="Calibri"/>
-          <w:b w:val="0"/>
-          <w:color w:val="333333"/>
-          <w:sz w:val="22"/>
-        </w:rPr>
-        <w:t xml:space="preserve">GestÃ£o completa do mix de produtos da empresa. Permite cadastramento com mÃºltiplos atributos: descriÃ§Ã£o completa, cÃ³digo interno SKU, cÃ³digo de barras EAN-13 para leitura por scanner, categoria mercadolÃ³gica, fotos em alta definiÃ§Ã£o, preÃ§o de custo, preÃ§o base de venda e margem praticada. Permite ainda a ativaÃ§Ã£o instantÃ¢nea de preÃ§os promocionais com perÃ­odo de vigÃªncia.</w:t>
-      </w:r>
-    </w:p>
-    <w:p>
-      <w:pPr>
-        <w:spacing w:before="160" w:after="80"/>
-      </w:pPr>
-      <w:r>
-        <w:rPr>
-          <w:rFonts w:ascii="Calibri" w:hAnsi="Calibri" w:eastAsia="Calibri"/>
-          <w:b/>
-          <w:color w:val="0B3D91"/>
-          <w:sz w:val="24"/>
-        </w:rPr>
-        <w:t>4.3 Tabelas de PreÃ§o e GovernanÃ§a Comercial</w:t>
-      </w:r>
-    </w:p>
-    <w:p>
-      <w:pPr>
-        <w:spacing w:after="120" w:line="276" w:lineRule="auto"/>
-      </w:pPr>
-      <w:r>
-        <w:rPr>
-          <w:rFonts w:ascii="Calibri" w:hAnsi="Calibri" w:eastAsia="Calibri"/>
-          <w:b w:val="0"/>
-          <w:color w:val="333333"/>
-          <w:sz w:val="22"/>
-        </w:rPr>
-        <w:t xml:space="preserve">O sistema disponibiliza um poderoso motor de tabelas de preÃ§o flexÃ­veis, essencial para operaÃ§Ãµes de distribuiÃ§Ã£o e atacado com polÃ­ticas comerciais diversificadas:</w:t>
-      </w:r>
-    </w:p>
-    <w:p>
-      <w:pPr>
-        <w:pStyle w:val="ListBullet"/>
-        <w:spacing w:after="80" w:line="260" w:lineRule="auto"/>
-      </w:pPr>
-      <w:r>
-        <w:rPr>
-          <w:rFonts w:ascii="Calibri" w:hAnsi="Calibri" w:eastAsia="Calibri"/>
-          <w:b/>
-          <w:color w:val="061A4F"/>
-          <w:sz w:val="22"/>
-        </w:rPr>
-        <w:t xml:space="preserve">â€¢ Tabelas por Canal de Atendimento: </w:t>
-      </w:r>
-      <w:r>
-        <w:rPr>
-          <w:rFonts w:ascii="Calibri" w:hAnsi="Calibri" w:eastAsia="Calibri"/>
-          <w:b w:val="0"/>
-          <w:color w:val="333333"/>
-          <w:sz w:val="22"/>
-        </w:rPr>
-        <w:t xml:space="preserve">Possibilidade de criar tabelas de preÃ§os especÃ­ficas para BalcÃ£o/PDV, Loja Online (Web) ou Vendedores Externos.</w:t>
-      </w:r>
-    </w:p>
-    <w:p>
-      <w:pPr>
-        <w:pStyle w:val="ListBullet"/>
-        <w:spacing w:after="80" w:line="260" w:lineRule="auto"/>
-      </w:pPr>
-      <w:r>
-        <w:rPr>
-          <w:rFonts w:ascii="Calibri" w:hAnsi="Calibri" w:eastAsia="Calibri"/>
-          <w:b/>
-          <w:color w:val="061A4F"/>
-          <w:sz w:val="22"/>
-        </w:rPr>
-        <w:t xml:space="preserve">â€¢ Tabelas Customizadas por Cliente: </w:t>
-      </w:r>
-      <w:r>
-        <w:rPr>
-          <w:rFonts w:ascii="Calibri" w:hAnsi="Calibri" w:eastAsia="Calibri"/>
-          <w:b w:val="0"/>
-          <w:color w:val="333333"/>
-          <w:sz w:val="22"/>
-        </w:rPr>
-        <w:t xml:space="preserve">VinculaÃ§Ã£o de tabelas de preÃ§o negociadas diretamente ao cadastro de clientes corporativos ou estratÃ©gicos.</w:t>
-      </w:r>
-    </w:p>
-    <w:p>
-      <w:pPr>
-        <w:pStyle w:val="ListBullet"/>
-        <w:spacing w:after="80" w:line="260" w:lineRule="auto"/>
-      </w:pPr>
-      <w:r>
-        <w:rPr>
-          <w:rFonts w:ascii="Calibri" w:hAnsi="Calibri" w:eastAsia="Calibri"/>
-          <w:b/>
-          <w:color w:val="061A4F"/>
-          <w:sz w:val="22"/>
-        </w:rPr>
-        <w:t xml:space="preserve">â€¢ Regra de PrecedÃªncia Estrita: </w:t>
-      </w:r>
-      <w:r>
-        <w:rPr>
-          <w:rFonts w:ascii="Calibri" w:hAnsi="Calibri" w:eastAsia="Calibri"/>
-          <w:b w:val="0"/>
-          <w:color w:val="333333"/>
-          <w:sz w:val="22"/>
-        </w:rPr>
-        <w:t xml:space="preserve">O mecanismo resolve o valor do produto na seguinte ordem de prioridade: PreÃ§o EspecÃ­fico do Cliente &gt; Tabela do Canal de Venda &gt; PreÃ§o Base do CatÃ¡logo. Essa hierarquia elimina erros de faturamento.</w:t>
-      </w:r>
-    </w:p>
-    <w:p>
-      <w:pPr>
-        <w:spacing w:before="160" w:after="80"/>
-      </w:pPr>
-      <w:r>
-        <w:rPr>
-          <w:rFonts w:ascii="Calibri" w:hAnsi="Calibri" w:eastAsia="Calibri"/>
-          <w:b/>
-          <w:color w:val="0B3D91"/>
-          <w:sz w:val="24"/>
-        </w:rPr>
-        <w:t>4.4 Estoque e MovimentaÃ§Ãµes FÃ­sicas</w:t>
-      </w:r>
-    </w:p>
-    <w:p>
-      <w:pPr>
-        <w:spacing w:after="120" w:line="276" w:lineRule="auto"/>
-      </w:pPr>
-      <w:r>
-        <w:rPr>
-          <w:rFonts w:ascii="Calibri" w:hAnsi="Calibri" w:eastAsia="Calibri"/>
-          <w:b w:val="0"/>
-          <w:color w:val="333333"/>
-          <w:sz w:val="22"/>
-        </w:rPr>
-        <w:t xml:space="preserve">Controle rigoroso de entradas e saÃ­das de mercadorias. Todas as movimentaÃ§Ãµes manuais exigem a especificaÃ§Ã£o de um motivo obrigatÃ³rio (ex.: InventÃ¡rio de Ajuste, DevoluÃ§Ã£o Comercial, Descarte por Avaria, BonificaÃ§Ã£o). O sistema diferencia visualmente Estoque FÃ­sico Total, Quantidade Reservada para Pedidos Ativos e Saldo Real DisponÃ­vel para Novas Vendas.</w:t>
-      </w:r>
-    </w:p>
-    <w:p>
-      <w:pPr>
-        <w:spacing w:before="160" w:after="80"/>
-      </w:pPr>
-      <w:r>
-        <w:rPr>
-          <w:rFonts w:ascii="Calibri" w:hAnsi="Calibri" w:eastAsia="Calibri"/>
-          <w:b/>
-          <w:color w:val="0B3D91"/>
-          <w:sz w:val="24"/>
-        </w:rPr>
-        <w:t>4.5 GestÃ£o de Fornecedores e Doca de Recebimento (Inbound)</w:t>
-      </w:r>
-    </w:p>
-    <w:p>
-      <w:pPr>
-        <w:spacing w:after="120" w:line="276" w:lineRule="auto"/>
-      </w:pPr>
-      <w:r>
-        <w:rPr>
-          <w:rFonts w:ascii="Calibri" w:hAnsi="Calibri" w:eastAsia="Calibri"/>
-          <w:b w:val="0"/>
-          <w:color w:val="333333"/>
-          <w:sz w:val="22"/>
-        </w:rPr>
-        <w:t xml:space="preserve">MÃ³dulo dedicado Ã  cadeia de suprimentos e abastecimento da empresa:</w:t>
-      </w:r>
-    </w:p>
-    <w:p>
-      <w:pPr>
-        <w:pStyle w:val="ListBullet"/>
-        <w:spacing w:after="80" w:line="260" w:lineRule="auto"/>
-      </w:pPr>
-      <w:r>
-        <w:rPr>
-          <w:rFonts w:ascii="Calibri" w:hAnsi="Calibri" w:eastAsia="Calibri"/>
-          <w:b/>
-          <w:color w:val="061A4F"/>
-          <w:sz w:val="22"/>
-        </w:rPr>
-        <w:t xml:space="preserve">â€¢ Cadastro de Fornecedores: </w:t>
-      </w:r>
-      <w:r>
-        <w:rPr>
-          <w:rFonts w:ascii="Calibri" w:hAnsi="Calibri" w:eastAsia="Calibri"/>
-          <w:b w:val="0"/>
-          <w:color w:val="333333"/>
-          <w:sz w:val="22"/>
-        </w:rPr>
-        <w:t xml:space="preserve">Registro completo com RazÃ£o Social, CNPJ, dados de contato dos representantes, prazos de entrega e condiÃ§Ãµes comerciais.</w:t>
-      </w:r>
-    </w:p>
-    <w:p>
-      <w:pPr>
-        <w:pStyle w:val="ListBullet"/>
-        <w:spacing w:after="80" w:line="260" w:lineRule="auto"/>
-      </w:pPr>
-      <w:r>
-        <w:rPr>
-          <w:rFonts w:ascii="Calibri" w:hAnsi="Calibri" w:eastAsia="Calibri"/>
-          <w:b/>
-          <w:color w:val="061A4F"/>
-          <w:sz w:val="22"/>
-        </w:rPr>
-        <w:t xml:space="preserve">â€¢ Ordens de Compra (/api/purchases): </w:t>
-      </w:r>
-      <w:r>
-        <w:rPr>
-          <w:rFonts w:ascii="Calibri" w:hAnsi="Calibri" w:eastAsia="Calibri"/>
-          <w:b w:val="0"/>
-          <w:color w:val="333333"/>
-          <w:sz w:val="22"/>
-        </w:rPr>
-        <w:t xml:space="preserve">GeraÃ§Ã£o e emissÃ£o de pedidos de compra para reposiÃ§Ã£o de estoque, com acompanhamento de status desde a emissÃ£o atÃ© o despacho pelo fornecedor.</w:t>
-      </w:r>
-    </w:p>
-    <w:p>
-      <w:pPr>
-        <w:pStyle w:val="ListBullet"/>
-        <w:spacing w:after="80" w:line="260" w:lineRule="auto"/>
-      </w:pPr>
-      <w:r>
-        <w:rPr>
-          <w:rFonts w:ascii="Calibri" w:hAnsi="Calibri" w:eastAsia="Calibri"/>
-          <w:b/>
-          <w:color w:val="061A4F"/>
-          <w:sz w:val="22"/>
-        </w:rPr>
-        <w:t xml:space="preserve">â€¢ Doca de Recebimento e ConferÃªncia: </w:t>
-      </w:r>
-      <w:r>
-        <w:rPr>
-          <w:rFonts w:ascii="Calibri" w:hAnsi="Calibri" w:eastAsia="Calibri"/>
-          <w:b w:val="0"/>
-          <w:color w:val="333333"/>
-          <w:sz w:val="22"/>
-        </w:rPr>
-        <w:t xml:space="preserve">ConferÃªncia fÃ­sica dos produtos entregues na doca com confronto de quantidades. A conclusÃ£o do recebimento gera a entrada contÃ¡bil no estoque automaticamente.</w:t>
-      </w:r>
-    </w:p>
-    <w:p>
-      <w:pPr>
-        <w:spacing w:before="160" w:after="80"/>
-      </w:pPr>
-      <w:r>
-        <w:rPr>
-          <w:rFonts w:ascii="Calibri" w:hAnsi="Calibri" w:eastAsia="Calibri"/>
-          <w:b/>
-          <w:color w:val="0B3D91"/>
-          <w:sz w:val="24"/>
-        </w:rPr>
-        <w:t>4.6 InteligÃªncia Comercial e CRM RFM</w:t>
-      </w:r>
-    </w:p>
-    <w:p>
-      <w:pPr>
-        <w:spacing w:after="120" w:line="276" w:lineRule="auto"/>
-      </w:pPr>
-      <w:r>
-        <w:rPr>
-          <w:rFonts w:ascii="Calibri" w:hAnsi="Calibri" w:eastAsia="Calibri"/>
-          <w:b w:val="0"/>
-          <w:color w:val="333333"/>
-          <w:sz w:val="22"/>
-        </w:rPr>
-        <w:t xml:space="preserve">Cadastro centralizado de clientes unificando dados fiscais (CPF/CNPJ, InscriÃ§Ã£o Estadual), endereÃ§os de entrega detalhados por bairro e geolocalizaÃ§Ã£o. O motor de CRM calcula automaticamente a matriz RFM (RecÃªncia da Ãºltima compra, FrequÃªncia mÃ©dia de pedidos e Valor MonetÃ¡rio acumulado), classificando a base em clientes CampeÃµes, FiÃ©is, Promissores, Em Risco e Inativos, permitindo campanhas de reativaÃ§Ã£o pelo time de vendas.</w:t>
-      </w:r>
-    </w:p>
-    <w:p>
-      <w:pPr>
-        <w:spacing w:before="160" w:after="80"/>
-      </w:pPr>
-      <w:r>
-        <w:rPr>
-          <w:rFonts w:ascii="Calibri" w:hAnsi="Calibri" w:eastAsia="Calibri"/>
-          <w:b/>
-          <w:color w:val="0B3D91"/>
-          <w:sz w:val="24"/>
-        </w:rPr>
-        <w:t>4.7 MÃ³dulo de LogÃ­stica, ExpediÃ§Ã£o e Despacho</w:t>
-      </w:r>
-    </w:p>
-    <w:p>
-      <w:pPr>
-        <w:spacing w:after="120" w:line="276" w:lineRule="auto"/>
-      </w:pPr>
-      <w:r>
-        <w:rPr>
-          <w:rFonts w:ascii="Calibri" w:hAnsi="Calibri" w:eastAsia="Calibri"/>
-          <w:b w:val="0"/>
-          <w:color w:val="333333"/>
-          <w:sz w:val="22"/>
-        </w:rPr>
-        <w:t xml:space="preserve">OrganizaÃ§Ã£o avanÃ§ada das entregas fÃ­sicas:</w:t>
-      </w:r>
-    </w:p>
-    <w:p>
-      <w:pPr>
-        <w:pStyle w:val="ListBullet"/>
-        <w:spacing w:after="80" w:line="260" w:lineRule="auto"/>
-      </w:pPr>
-      <w:r>
-        <w:rPr>
-          <w:rFonts w:ascii="Calibri" w:hAnsi="Calibri" w:eastAsia="Calibri"/>
-          <w:b/>
-          <w:color w:val="061A4F"/>
-          <w:sz w:val="22"/>
-        </w:rPr>
-        <w:t xml:space="preserve">â€¢ Agrupamento por Bairros: </w:t>
-      </w:r>
-      <w:r>
-        <w:rPr>
-          <w:rFonts w:ascii="Calibri" w:hAnsi="Calibri" w:eastAsia="Calibri"/>
-          <w:b w:val="0"/>
-          <w:color w:val="333333"/>
-          <w:sz w:val="22"/>
-        </w:rPr>
-        <w:t xml:space="preserve">Agrupamento inteligente de pedidos em separaÃ§Ã£o conforme a localizaÃ§Ã£o geogrÃ¡fica dos clientes, otimizando o carregamento.</w:t>
-      </w:r>
-    </w:p>
-    <w:p>
-      <w:pPr>
-        <w:pStyle w:val="ListBullet"/>
-        <w:spacing w:after="80" w:line="260" w:lineRule="auto"/>
-      </w:pPr>
-      <w:r>
-        <w:rPr>
-          <w:rFonts w:ascii="Calibri" w:hAnsi="Calibri" w:eastAsia="Calibri"/>
-          <w:b/>
-          <w:color w:val="061A4F"/>
-          <w:sz w:val="22"/>
-        </w:rPr>
-        <w:t xml:space="preserve">â€¢ RoteirizaÃ§Ã£o e Romaneios: </w:t>
-      </w:r>
-      <w:r>
-        <w:rPr>
-          <w:rFonts w:ascii="Calibri" w:hAnsi="Calibri" w:eastAsia="Calibri"/>
-          <w:b w:val="0"/>
-          <w:color w:val="333333"/>
-          <w:sz w:val="22"/>
-        </w:rPr>
-        <w:t xml:space="preserve">Montagem de rotas vinculadas a veÃ­culos e motoristas especÃ­ficos, com emissÃ£o do romaneio de carga consolidado.</w:t>
-      </w:r>
-    </w:p>
-    <w:p>
-      <w:pPr>
-        <w:pStyle w:val="ListBullet"/>
-        <w:spacing w:after="80" w:line="260" w:lineRule="auto"/>
-      </w:pPr>
-      <w:r>
-        <w:rPr>
-          <w:rFonts w:ascii="Calibri" w:hAnsi="Calibri" w:eastAsia="Calibri"/>
-          <w:b/>
-          <w:color w:val="061A4F"/>
-          <w:sz w:val="22"/>
-        </w:rPr>
-        <w:t xml:space="preserve">â€¢ Painel de Pedidos Retornados (â†©): </w:t>
-      </w:r>
-      <w:r>
-        <w:rPr>
-          <w:rFonts w:ascii="Calibri" w:hAnsi="Calibri" w:eastAsia="Calibri"/>
-          <w:b w:val="0"/>
-          <w:color w:val="333333"/>
-          <w:sz w:val="22"/>
-        </w:rPr>
-        <w:t xml:space="preserve">Dashboard em tempo real exibindo todos os pedidos que nÃ£o puderam ser entregues pelos motoristas. A tela detalha o nÃºmero do pedido, cliente, endereÃ§o, motorista da rota, data/hora da ocorrÃªncia, motivo padronizado e observaÃ§Ãµes complementares, permitindo a pronta reatribuiÃ§Ã£o para uma nova rota ou devoluÃ§Ã£o ao estoque.</w:t>
-      </w:r>
-    </w:p>
-    <w:p>
-      <w:pPr>
-        <w:spacing w:before="160" w:after="80"/>
-      </w:pPr>
-      <w:r>
-        <w:rPr>
-          <w:rFonts w:ascii="Calibri" w:hAnsi="Calibri" w:eastAsia="Calibri"/>
-          <w:b/>
-          <w:color w:val="0B3D91"/>
-          <w:sz w:val="24"/>
-        </w:rPr>
-        <w:t>4.8 Auditoria Digital e Assistente de GestÃ£o por IA</w:t>
-      </w:r>
-    </w:p>
-    <w:p>
-      <w:pPr>
-        <w:spacing w:after="120" w:line="276" w:lineRule="auto"/>
-      </w:pPr>
-      <w:r>
-        <w:rPr>
-          <w:rFonts w:ascii="Calibri" w:hAnsi="Calibri" w:eastAsia="Calibri"/>
-          <w:b w:val="0"/>
-          <w:color w:val="333333"/>
-          <w:sz w:val="22"/>
-        </w:rPr>
-        <w:t xml:space="preserve">Trilha de auditoria digital com encadeamento criptogrÃ¡fico SHA-256 (audit_logs), gravando cada criaÃ§Ã£o, alteraÃ§Ã£o ou exclusÃ£o de dados com identificaÃ§Ã£o do operador, endereÃ§o IP e timestamp. Adicionalmente, a Torre de Controle integra um assistente inteligente (Groq IA) capaz de responder a consultas gerenciais sobre faturamento, curva ABC e eficiÃªncia de entregas.</w:t>
-      </w:r>
-    </w:p>
-    <w:p>
-      <w:pPr>
-        <w:spacing w:before="160" w:after="80"/>
-      </w:pPr>
-      <w:r>
-        <w:rPr>
-          <w:rFonts w:ascii="Calibri" w:hAnsi="Calibri" w:eastAsia="Calibri"/>
-          <w:b/>
-          <w:color w:val="0B3D91"/>
-          <w:sz w:val="24"/>
-        </w:rPr>
-        <w:t>4.9 Identidade Empresarial e CustomizaÃ§Ã£o Visual</w:t>
-      </w:r>
-    </w:p>
-    <w:p>
-      <w:pPr>
-        <w:spacing w:after="120" w:line="276" w:lineRule="auto"/>
-      </w:pPr>
-      <w:r>
-        <w:rPr>
-          <w:rFonts w:ascii="Calibri" w:hAnsi="Calibri" w:eastAsia="Calibri"/>
-          <w:b w:val="0"/>
-          <w:color w:val="333333"/>
-          <w:sz w:val="22"/>
-        </w:rPr>
-        <w:t xml:space="preserve">Em ConfiguraÃ§Ãµes do Sistema, os administradores gerenciam a identidade corporativa da marca: upload de logotipo institucional, capa de login, capa da Loja Online, dados cadastrais da empresa e paleta de cores. Essas preferÃªncias sÃ£o propagadas instantaneamente em CSS para todas as interfaces da plataforma.</w:t>
-      </w:r>
-    </w:p>
-    <w:p>
-      <w:pPr>
-        <w:spacing w:before="240" w:after="160"/>
-      </w:pPr>
-      <w:r>
-        <w:rPr>
-          <w:rFonts w:ascii="Calibri" w:hAnsi="Calibri" w:eastAsia="Calibri"/>
-          <w:b/>
-          <w:color w:val="061A4F"/>
-          <w:sz w:val="36"/>
-        </w:rPr>
-        <w:t>5. OperaÃ§Ã£o nos Canais de Venda e Entrega</w:t>
-      </w:r>
-    </w:p>
-    <w:p>
-      <w:pPr>
-        <w:spacing w:before="160" w:after="80"/>
-      </w:pPr>
-      <w:r>
-        <w:rPr>
-          <w:rFonts w:ascii="Calibri" w:hAnsi="Calibri" w:eastAsia="Calibri"/>
-          <w:b/>
-          <w:color w:val="0B3D91"/>
-          <w:sz w:val="24"/>
-        </w:rPr>
-        <w:t>5.1 Vendedor Externo (App Mobile / PWA)</w:t>
-      </w:r>
-    </w:p>
-    <w:p>
-      <w:pPr>
-        <w:spacing w:after="120" w:line="276" w:lineRule="auto"/>
-      </w:pPr>
-      <w:r>
-        <w:rPr>
-          <w:rFonts w:ascii="Calibri" w:hAnsi="Calibri" w:eastAsia="Calibri"/>
-          <w:b w:val="0"/>
-          <w:color w:val="333333"/>
-          <w:sz w:val="22"/>
-        </w:rPr>
-        <w:t xml:space="preserve">O aplicativo de vendas externas oferece aos consultores de campo todas as ferramentas necessÃ¡rias para atendimento Ã¡gil: carteira de clientes atribuÃ­da, histÃ³rico de pedidos, consulta de saldo em tempo real de produtos e lanÃ§amento de novos pedidos. O app conta com arquitetura offline-first (outbox pattern), permitindo emitir pedidos mesmo em galpÃµes ou Ã¡reas sem sinal de internet; assim que o dispositivo detecta conexÃ£o, a fila de pedidos Ã© transmitida e confirmada no servidor.</w:t>
-      </w:r>
-    </w:p>
-    <w:p>
-      <w:pPr>
-        <w:spacing w:before="160" w:after="80"/>
-      </w:pPr>
-      <w:r>
-        <w:rPr>
-          <w:rFonts w:ascii="Calibri" w:hAnsi="Calibri" w:eastAsia="Calibri"/>
-          <w:b/>
-          <w:color w:val="0B3D91"/>
-          <w:sz w:val="24"/>
-        </w:rPr>
-        <w:t>5.2 Caixa e Frente de Loja (PDV)</w:t>
-      </w:r>
-    </w:p>
-    <w:p>
-      <w:pPr>
-        <w:spacing w:after="120" w:line="276" w:lineRule="auto"/>
-      </w:pPr>
-      <w:r>
-        <w:rPr>
-          <w:rFonts w:ascii="Calibri" w:hAnsi="Calibri" w:eastAsia="Calibri"/>
-          <w:b w:val="0"/>
-          <w:color w:val="333333"/>
-          <w:sz w:val="22"/>
-        </w:rPr>
-        <w:t xml:space="preserve">O ponto de venda presencial foi projetado para alta velocidade de atendimento no balcÃ£o: leitura instantÃ¢nea de cÃ³digos de barras, busca rÃ¡pida por descriÃ§Ã£o, aplicaÃ§Ã£o de descontos autorizados e registro de recebimentos em mÃºltiplas formas de pagamento (Dinheiro, CartÃ£o de DÃ©bito, CartÃ£o de CrÃ©dito e PIX com confirmaÃ§Ã£o). O sistema gera comprovantes fiscais e recibos tÃ©rmicos padronizados.</w:t>
-      </w:r>
-    </w:p>
-    <w:p>
-      <w:pPr>
-        <w:spacing w:before="160" w:after="80"/>
-      </w:pPr>
-      <w:r>
-        <w:rPr>
-          <w:rFonts w:ascii="Calibri" w:hAnsi="Calibri" w:eastAsia="Calibri"/>
-          <w:b/>
-          <w:color w:val="0B3D91"/>
-          <w:sz w:val="24"/>
-        </w:rPr>
-        <w:t>5.3 Loja Online (E-Commerce B2B/B2C)</w:t>
-      </w:r>
-    </w:p>
-    <w:p>
-      <w:pPr>
-        <w:spacing w:after="120" w:line="276" w:lineRule="auto"/>
-      </w:pPr>
-      <w:r>
-        <w:rPr>
-          <w:rFonts w:ascii="Calibri" w:hAnsi="Calibri" w:eastAsia="Calibri"/>
-          <w:b w:val="0"/>
-          <w:color w:val="333333"/>
-          <w:sz w:val="22"/>
-        </w:rPr>
-        <w:t xml:space="preserve">Portal responsivo acessÃ­vel via computador ou celular. Apresenta catÃ¡logo organizado por categorias, barra de pesquisa inteligente, carrinho de compras, cÃ¡lculo automÃ¡tico de frete baseado no bairro de entrega do cliente e acompanhamento da evoluÃ§Ã£o do pedido em tempo real.</w:t>
-      </w:r>
-    </w:p>
-    <w:p>
-      <w:pPr>
-        <w:spacing w:before="160" w:after="80"/>
-      </w:pPr>
-      <w:r>
-        <w:rPr>
-          <w:rFonts w:ascii="Calibri" w:hAnsi="Calibri" w:eastAsia="Calibri"/>
-          <w:b/>
-          <w:color w:val="0B3D91"/>
-          <w:sz w:val="24"/>
-        </w:rPr>
-        <w:t>5.4 App do Motorista (Entregas e GestÃ£o de OcorrÃªncias)</w:t>
-      </w:r>
-    </w:p>
-    <w:p>
-      <w:pPr>
-        <w:spacing w:after="120" w:line="276" w:lineRule="auto"/>
-      </w:pPr>
-      <w:r>
-        <w:rPr>
-          <w:rFonts w:ascii="Calibri" w:hAnsi="Calibri" w:eastAsia="Calibri"/>
-          <w:b w:val="0"/>
-          <w:color w:val="333333"/>
-          <w:sz w:val="22"/>
-        </w:rPr>
-        <w:t xml:space="preserve">O aplicativo mÃ³vel do motorista organiza as paradas da rota do dia com instruÃ§Ãµes detalhadas de entrega e ferramentas de comunicaÃ§Ã£o:</w:t>
-      </w:r>
-    </w:p>
-    <w:p>
-      <w:pPr>
-        <w:pStyle w:val="ListBullet"/>
-        <w:spacing w:after="80" w:line="260" w:lineRule="auto"/>
-      </w:pPr>
-      <w:r>
-        <w:rPr>
-          <w:rFonts w:ascii="Calibri" w:hAnsi="Calibri" w:eastAsia="Calibri"/>
-          <w:b/>
-          <w:color w:val="061A4F"/>
-          <w:sz w:val="22"/>
-        </w:rPr>
-        <w:t xml:space="preserve">â€¢ Contato Imediato via WhatsApp: </w:t>
-      </w:r>
-      <w:r>
-        <w:rPr>
-          <w:rFonts w:ascii="Calibri" w:hAnsi="Calibri" w:eastAsia="Calibri"/>
-          <w:b w:val="0"/>
-          <w:color w:val="333333"/>
-          <w:sz w:val="22"/>
-        </w:rPr>
-        <w:t xml:space="preserve">BotÃ£o integrado em cada parada que abre diretamente o WhatsApp do cliente com mensagem prÃ©-formatada: 'OlÃ¡ {Nome}, sou o motorista da Xiquim Vargas e estou a caminho com sua entrega!'.</w:t>
-      </w:r>
-    </w:p>
-    <w:p>
-      <w:pPr>
-        <w:pStyle w:val="ListBullet"/>
-        <w:spacing w:after="80" w:line="260" w:lineRule="auto"/>
-      </w:pPr>
-      <w:r>
-        <w:rPr>
-          <w:rFonts w:ascii="Calibri" w:hAnsi="Calibri" w:eastAsia="Calibri"/>
-          <w:b/>
-          <w:color w:val="061A4F"/>
-          <w:sz w:val="22"/>
-        </w:rPr>
-        <w:t xml:space="preserve">â€¢ LigaÃ§Ã£o TelefÃ´nica Direta: </w:t>
-      </w:r>
-      <w:r>
-        <w:rPr>
-          <w:rFonts w:ascii="Calibri" w:hAnsi="Calibri" w:eastAsia="Calibri"/>
-          <w:b w:val="0"/>
-          <w:color w:val="333333"/>
-          <w:sz w:val="22"/>
-        </w:rPr>
-        <w:t xml:space="preserve">BotÃ£o de discagem rÃ¡pida (tel:) para chamada direta ao cliente em um toque, eliminando digitaÃ§Ã£o de nÃºmeros.</w:t>
-      </w:r>
-    </w:p>
-    <w:p>
-      <w:pPr>
-        <w:pStyle w:val="ListBullet"/>
-        <w:spacing w:after="80" w:line="260" w:lineRule="auto"/>
-      </w:pPr>
-      <w:r>
-        <w:rPr>
-          <w:rFonts w:ascii="Calibri" w:hAnsi="Calibri" w:eastAsia="Calibri"/>
-          <w:b/>
-          <w:color w:val="061A4F"/>
-          <w:sz w:val="22"/>
-        </w:rPr>
-        <w:t xml:space="preserve">â€¢ ConclusÃ£o de Entrega com Sucesso: </w:t>
-      </w:r>
-      <w:r>
-        <w:rPr>
-          <w:rFonts w:ascii="Calibri" w:hAnsi="Calibri" w:eastAsia="Calibri"/>
-          <w:b w:val="0"/>
-          <w:color w:val="333333"/>
-          <w:sz w:val="22"/>
-        </w:rPr>
-        <w:t xml:space="preserve">Ao finalizar a entrega, o motorista coleta a assinatura na tela e tira foto do canhoto ou da mercadoria entregue, submetendo o comprovante digital para arquivamento no servidor.</w:t>
-      </w:r>
-    </w:p>
-    <w:p>
-      <w:pPr>
-        <w:pStyle w:val="ListBullet"/>
-        <w:spacing w:after="80" w:line="260" w:lineRule="auto"/>
-      </w:pPr>
-      <w:r>
-        <w:rPr>
-          <w:rFonts w:ascii="Calibri" w:hAnsi="Calibri" w:eastAsia="Calibri"/>
-          <w:b/>
-          <w:color w:val="061A4F"/>
-          <w:sz w:val="22"/>
-        </w:rPr>
-        <w:t xml:space="preserve">â€¢ Mecanismo de Insucesso (Marcar como NÃ£o ConcluÃ­da): </w:t>
-      </w:r>
-      <w:r>
-        <w:rPr>
-          <w:rFonts w:ascii="Calibri" w:hAnsi="Calibri" w:eastAsia="Calibri"/>
-          <w:b w:val="0"/>
-          <w:color w:val="333333"/>
-          <w:sz w:val="22"/>
-        </w:rPr>
-        <w:t xml:space="preserve">Caso nÃ£o seja possÃ­vel entregar o pedido, o motorista aciona o botÃ£o 'NÃ£o ConcluÃ­da'.</w:t>
-      </w:r>
-    </w:p>
-    <w:p>
-      <w:pPr>
-        <w:spacing w:after="120" w:line="276" w:lineRule="auto"/>
-      </w:pPr>
-      <w:r>
-        <w:rPr>
-          <w:rFonts w:ascii="Calibri" w:hAnsi="Calibri" w:eastAsia="Calibri"/>
-          <w:b w:val="0"/>
-          <w:color w:val="333333"/>
-          <w:sz w:val="22"/>
-        </w:rPr>
-        <w:t xml:space="preserve">No registro de insucesso, o motorista obrigatoriamente escolhe uma das opÃ§Ãµes prÃ©-definidas:</w:t>
-      </w:r>
-    </w:p>
-    <w:p>
-      <w:pPr>
-        <w:pStyle w:val="ListBullet"/>
-        <w:spacing w:after="80" w:line="260" w:lineRule="auto"/>
-      </w:pPr>
-      <w:r>
-        <w:rPr>
-          <w:rFonts w:ascii="Calibri" w:hAnsi="Calibri" w:eastAsia="Calibri"/>
-          <w:b/>
-          <w:color w:val="061A4F"/>
+          <w:color w:val="FD5E02"/>
           <w:sz w:val="22"/>
         </w:rPr>
         <w:t xml:space="preserve">1. </w:t>
       </w:r>
       <w:r>
         <w:rPr>
-          <w:rFonts w:ascii="Calibri" w:hAnsi="Calibri" w:eastAsia="Calibri"/>
-          <w:b w:val="0"/>
+          <w:b/>
+          <w:color w:val="061A4F"/>
+          <w:sz w:val="22"/>
+        </w:rPr>
+        <w:t xml:space="preserve">Assets Embutidos no APK:</w:t>
+      </w:r>
+      <w:r>
+        <w:rPr>
           <w:color w:val="333333"/>
           <w:sz w:val="22"/>
         </w:rPr>
-        <w:t xml:space="preserve">Cliente nÃ£o se encontra no local</w:t>
+        <w:t xml:space="preserve"> Todos os arquivos de interface (</w:t>
+      </w:r>
+      <w:r>
+        <w:rPr>
+          <w:rFonts w:ascii="Consolas" w:hAnsi="Consolas"/>
+          <w:color w:val="C7254E"/>
+          <w:shd w:val="clear" w:color="auto" w:fill="F9F2F4"/>
+          <w:sz w:val="20"/>
+        </w:rPr>
+        <w:t xml:space="preserve">vendedor.html</w:t>
+      </w:r>
+      <w:r>
+        <w:rPr>
+          <w:color w:val="333333"/>
+          <w:sz w:val="22"/>
+        </w:rPr>
+        <w:t xml:space="preserve">, </w:t>
+      </w:r>
+      <w:r>
+        <w:rPr>
+          <w:rFonts w:ascii="Consolas" w:hAnsi="Consolas"/>
+          <w:color w:val="C7254E"/>
+          <w:shd w:val="clear" w:color="auto" w:fill="F9F2F4"/>
+          <w:sz w:val="20"/>
+        </w:rPr>
+        <w:t xml:space="preserve">motorista.html</w:t>
+      </w:r>
+      <w:r>
+        <w:rPr>
+          <w:color w:val="333333"/>
+          <w:sz w:val="22"/>
+        </w:rPr>
+        <w:t xml:space="preserve">, </w:t>
+      </w:r>
+      <w:r>
+        <w:rPr>
+          <w:rFonts w:ascii="Consolas" w:hAnsi="Consolas"/>
+          <w:color w:val="C7254E"/>
+          <w:shd w:val="clear" w:color="auto" w:fill="F9F2F4"/>
+          <w:sz w:val="20"/>
+        </w:rPr>
+        <w:t xml:space="preserve">pdv.html</w:t>
+      </w:r>
+      <w:r>
+        <w:rPr>
+          <w:color w:val="333333"/>
+          <w:sz w:val="22"/>
+        </w:rPr>
+        <w:t xml:space="preserve">, </w:t>
+      </w:r>
+      <w:r>
+        <w:rPr>
+          <w:rFonts w:ascii="Consolas" w:hAnsi="Consolas"/>
+          <w:color w:val="C7254E"/>
+          <w:shd w:val="clear" w:color="auto" w:fill="F9F2F4"/>
+          <w:sz w:val="20"/>
+        </w:rPr>
+        <w:t xml:space="preserve">admin.html</w:t>
+      </w:r>
+      <w:r>
+        <w:rPr>
+          <w:color w:val="333333"/>
+          <w:sz w:val="22"/>
+        </w:rPr>
+        <w:t xml:space="preserve">, estilos </w:t>
+      </w:r>
+      <w:r>
+        <w:rPr>
+          <w:rFonts w:ascii="Consolas" w:hAnsi="Consolas"/>
+          <w:color w:val="C7254E"/>
+          <w:shd w:val="clear" w:color="auto" w:fill="F9F2F4"/>
+          <w:sz w:val="20"/>
+        </w:rPr>
+        <w:t xml:space="preserve">styles.css</w:t>
+      </w:r>
+      <w:r>
+        <w:rPr>
+          <w:color w:val="333333"/>
+          <w:sz w:val="22"/>
+        </w:rPr>
+        <w:t xml:space="preserve">, scripts </w:t>
+      </w:r>
+      <w:r>
+        <w:rPr>
+          <w:rFonts w:ascii="Consolas" w:hAnsi="Consolas"/>
+          <w:color w:val="C7254E"/>
+          <w:shd w:val="clear" w:color="auto" w:fill="F9F2F4"/>
+          <w:sz w:val="20"/>
+        </w:rPr>
+        <w:t xml:space="preserve">app.js</w:t>
+      </w:r>
+      <w:r>
+        <w:rPr>
+          <w:color w:val="333333"/>
+          <w:sz w:val="22"/>
+        </w:rPr>
+        <w:t xml:space="preserve"> e </w:t>
+      </w:r>
+      <w:r>
+        <w:rPr>
+          <w:rFonts w:ascii="Consolas" w:hAnsi="Consolas"/>
+          <w:color w:val="C7254E"/>
+          <w:shd w:val="clear" w:color="auto" w:fill="F9F2F4"/>
+          <w:sz w:val="20"/>
+        </w:rPr>
+        <w:t xml:space="preserve">role.js</w:t>
+      </w:r>
+      <w:r>
+        <w:rPr>
+          <w:color w:val="333333"/>
+          <w:sz w:val="22"/>
+        </w:rPr>
+        <w:t xml:space="preserve">, além dos logos institucionais em alta definição) estão gravados dentro do pacote em </w:t>
+      </w:r>
+      <w:r>
+        <w:rPr>
+          <w:rFonts w:ascii="Consolas" w:hAnsi="Consolas"/>
+          <w:color w:val="C7254E"/>
+          <w:shd w:val="clear" w:color="auto" w:fill="F9F2F4"/>
+          <w:sz w:val="20"/>
+        </w:rPr>
+        <w:t xml:space="preserve">app/src/main/assets/www/</w:t>
+      </w:r>
+      <w:r>
+        <w:rPr>
+          <w:color w:val="333333"/>
+          <w:sz w:val="22"/>
+        </w:rPr>
+        <w:t xml:space="preserve">.</w:t>
       </w:r>
     </w:p>
     <w:p>
       <w:pPr>
-        <w:pStyle w:val="ListBullet"/>
-        <w:spacing w:after="80" w:line="260" w:lineRule="auto"/>
+        <w:spacing w:after="60" w:line="240" w:lineRule="auto"/>
       </w:pPr>
       <w:r>
         <w:rPr>
-          <w:rFonts w:ascii="Calibri" w:hAnsi="Calibri" w:eastAsia="Calibri"/>
           <w:b/>
-          <w:color w:val="061A4F"/>
+          <w:color w:val="FD5E02"/>
           <w:sz w:val="22"/>
         </w:rPr>
         <w:t xml:space="preserve">2. </w:t>
       </w:r>
       <w:r>
         <w:rPr>
-          <w:rFonts w:ascii="Calibri" w:hAnsi="Calibri" w:eastAsia="Calibri"/>
-          <w:b w:val="0"/>
+          <w:b/>
+          <w:color w:val="061A4F"/>
+          <w:sz w:val="22"/>
+        </w:rPr>
+        <w:t xml:space="preserve">Interceptação Nativa (`shouldInterceptRequest`):</w:t>
+      </w:r>
+      <w:r>
+        <w:rPr>
           <w:color w:val="333333"/>
           <w:sz w:val="22"/>
         </w:rPr>
-        <w:t xml:space="preserve">Cliente se recusou a receber o pedido</w:t>
+        <w:t xml:space="preserve"> Ao abrir o app, qualquer chamada para páginas ou assets locais é servida do próprio armazenamento interno do smartphone em ~0.05s, mesmo em Modo Avião.</w:t>
       </w:r>
     </w:p>
     <w:p>
       <w:pPr>
-        <w:pStyle w:val="ListBullet"/>
-        <w:spacing w:after="80" w:line="260" w:lineRule="auto"/>
+        <w:spacing w:after="60" w:line="240" w:lineRule="auto"/>
       </w:pPr>
       <w:r>
         <w:rPr>
-          <w:rFonts w:ascii="Calibri" w:hAnsi="Calibri" w:eastAsia="Calibri"/>
           <w:b/>
-          <w:color w:val="061A4F"/>
+          <w:color w:val="FD5E02"/>
           <w:sz w:val="22"/>
         </w:rPr>
         <w:t xml:space="preserve">3. </w:t>
       </w:r>
       <w:r>
         <w:rPr>
-          <w:rFonts w:ascii="Calibri" w:hAnsi="Calibri" w:eastAsia="Calibri"/>
-          <w:b w:val="0"/>
+          <w:b/>
+          <w:color w:val="061A4F"/>
+          <w:sz w:val="22"/>
+        </w:rPr>
+        <w:t xml:space="preserve">URL Oficial Fixa Embutida:</w:t>
+      </w:r>
+      <w:r>
+        <w:rPr>
           <w:color w:val="333333"/>
           <w:sz w:val="22"/>
         </w:rPr>
-        <w:t xml:space="preserve">Pedido incorreto ou divergente</w:t>
+        <w:t xml:space="preserve"> A URL de produção (</w:t>
+      </w:r>
+      <w:r>
+        <w:rPr>
+          <w:rFonts w:ascii="Consolas" w:hAnsi="Consolas"/>
+          <w:color w:val="C7254E"/>
+          <w:shd w:val="clear" w:color="auto" w:fill="F9F2F4"/>
+          <w:sz w:val="20"/>
+        </w:rPr>
+        <w:t xml:space="preserve">https://xiquim-vargas-erp.onrender.com</w:t>
+      </w:r>
+      <w:r>
+        <w:rPr>
+          <w:color w:val="333333"/>
+          <w:sz w:val="22"/>
+        </w:rPr>
+        <w:t xml:space="preserve">) está pré-configurada em código nativo (</w:t>
+      </w:r>
+      <w:r>
+        <w:rPr>
+          <w:rFonts w:ascii="Consolas" w:hAnsi="Consolas"/>
+          <w:color w:val="C7254E"/>
+          <w:shd w:val="clear" w:color="auto" w:fill="F9F2F4"/>
+          <w:sz w:val="20"/>
+        </w:rPr>
+        <w:t xml:space="preserve">Api.kt</w:t>
+      </w:r>
+      <w:r>
+        <w:rPr>
+          <w:color w:val="333333"/>
+          <w:sz w:val="22"/>
+        </w:rPr>
+        <w:t xml:space="preserve">). O colaborador não precisa digitar endereços de servidor.</w:t>
       </w:r>
     </w:p>
     <w:p>
       <w:pPr>
-        <w:pStyle w:val="ListBullet"/>
-        <w:spacing w:after="80" w:line="260" w:lineRule="auto"/>
+        <w:spacing w:after="60" w:line="240" w:lineRule="auto"/>
       </w:pPr>
       <w:r>
         <w:rPr>
-          <w:rFonts w:ascii="Calibri" w:hAnsi="Calibri" w:eastAsia="Calibri"/>
           <w:b/>
-          <w:color w:val="061A4F"/>
+          <w:color w:val="FD5E02"/>
           <w:sz w:val="22"/>
         </w:rPr>
         <w:t xml:space="preserve">4. </w:t>
       </w:r>
       <w:r>
         <w:rPr>
-          <w:rFonts w:ascii="Calibri" w:hAnsi="Calibri" w:eastAsia="Calibri"/>
-          <w:b w:val="0"/>
+          <w:b/>
+          <w:color w:val="061A4F"/>
+          <w:sz w:val="22"/>
+        </w:rPr>
+        <w:t xml:space="preserve">Fila Local em IndexedDB:</w:t>
+      </w:r>
+      <w:r>
+        <w:rPr>
           <w:color w:val="333333"/>
           <w:sz w:val="22"/>
         </w:rPr>
-        <w:t xml:space="preserve">Problemas mecÃ¢nicos com o veÃ­culo</w:t>
+        <w:t xml:space="preserve"> Caso o operador emita um pedido ou realize uma venda sem conexão, a operação é salva na outbox local (</w:t>
+      </w:r>
+      <w:r>
+        <w:rPr>
+          <w:rFonts w:ascii="Consolas" w:hAnsi="Consolas"/>
+          <w:color w:val="C7254E"/>
+          <w:shd w:val="clear" w:color="auto" w:fill="F9F2F4"/>
+          <w:sz w:val="20"/>
+        </w:rPr>
+        <w:t xml:space="preserve">xv-offline-v1-...</w:t>
+      </w:r>
+      <w:r>
+        <w:rPr>
+          <w:color w:val="333333"/>
+          <w:sz w:val="22"/>
+        </w:rPr>
+        <w:t xml:space="preserve">). Assim que a internet for detectada, a função </w:t>
+      </w:r>
+      <w:r>
+        <w:rPr>
+          <w:rFonts w:ascii="Consolas" w:hAnsi="Consolas"/>
+          <w:color w:val="C7254E"/>
+          <w:shd w:val="clear" w:color="auto" w:fill="F9F2F4"/>
+          <w:sz w:val="20"/>
+        </w:rPr>
+        <w:t xml:space="preserve">syncOfflineQueue()</w:t>
+      </w:r>
+      <w:r>
+        <w:rPr>
+          <w:color w:val="333333"/>
+          <w:sz w:val="22"/>
+        </w:rPr>
+        <w:t xml:space="preserve"> envia os dados automaticamente para a nuvem.</w:t>
       </w:r>
     </w:p>
     <w:p>
       <w:pPr>
-        <w:pStyle w:val="ListBullet"/>
-        <w:spacing w:after="80" w:line="260" w:lineRule="auto"/>
+        <w:spacing w:after="60" w:line="240" w:lineRule="auto"/>
       </w:pPr>
       <w:r>
         <w:rPr>
-          <w:rFonts w:ascii="Calibri" w:hAnsi="Calibri" w:eastAsia="Calibri"/>
           <w:b/>
-          <w:color w:val="061A4F"/>
+          <w:color w:val="FD5E02"/>
           <w:sz w:val="22"/>
         </w:rPr>
         <w:t xml:space="preserve">5. </w:t>
       </w:r>
       <w:r>
         <w:rPr>
-          <w:rFonts w:ascii="Calibri" w:hAnsi="Calibri" w:eastAsia="Calibri"/>
-          <w:b w:val="0"/>
+          <w:b/>
+          <w:color w:val="061A4F"/>
+          <w:sz w:val="22"/>
+        </w:rPr>
+        <w:t xml:space="preserve">Ícone Oficial HD Institucional:</w:t>
+      </w:r>
+      <w:r>
+        <w:rPr>
           <w:color w:val="333333"/>
           <w:sz w:val="22"/>
         </w:rPr>
-        <w:t xml:space="preserve">Imprevisto operacional com a equipe</w:t>
+        <w:t xml:space="preserve"> Todos os 4 aplicativos exibem o ícone oficial em alta definição (</w:t>
+      </w:r>
+      <w:r>
+        <w:rPr>
+          <w:rFonts w:ascii="Consolas" w:hAnsi="Consolas"/>
+          <w:color w:val="C7254E"/>
+          <w:shd w:val="clear" w:color="auto" w:fill="F9F2F4"/>
+          <w:sz w:val="20"/>
+        </w:rPr>
+        <w:t xml:space="preserve">01_Logo_Xiquim_Vargas_HD.png</w:t>
+      </w:r>
+      <w:r>
+        <w:rPr>
+          <w:color w:val="333333"/>
+          <w:sz w:val="22"/>
+        </w:rPr>
+        <w:t xml:space="preserve">) na tela inicial e gaveta de aplicativos.</w:t>
+      </w:r>
+    </w:p>
+    <w:p>
+      <w:pPr>
+        <w:pStyle w:val="Heading2"/>
+        <w:spacing w:before="220" w:after="100"/>
+      </w:pPr>
+      <w:r>
+        <w:rPr>
+          <w:b/>
+          <w:color w:val="FD5E02"/>
+          <w:sz w:val="26"/>
+        </w:rPr>
+        <w:t xml:space="preserve">3. SINCRONIZAÇÃO EM TEMPO REAL (ZERO RELOAD)</w:t>
+      </w:r>
+    </w:p>
+    <w:p>
+      <w:pPr>
+        <w:spacing w:after="120" w:line="260" w:lineRule="auto"/>
+      </w:pPr>
+      <w:r>
+        <w:rPr>
+          <w:color w:val="333333"/>
+          <w:sz w:val="22"/>
+        </w:rPr>
+        <w:t xml:space="preserve">O ERP AutonomIA é construído sobre uma arquitetura de sincronização contínua que elimina a necessidade de pressionar F5 ou recarregar a tela:</w:t>
       </w:r>
     </w:p>
     <w:p>
       <w:pPr>
         <w:pStyle w:val="ListBullet"/>
-        <w:spacing w:after="80" w:line="260" w:lineRule="auto"/>
+        <w:spacing w:after="60" w:line="240" w:lineRule="auto"/>
       </w:pPr>
       <w:r>
         <w:rPr>
-          <w:rFonts w:ascii="Calibri" w:hAnsi="Calibri" w:eastAsia="Calibri"/>
           <w:b/>
           <w:color w:val="061A4F"/>
           <w:sz w:val="22"/>
         </w:rPr>
-        <w:t xml:space="preserve">6. </w:t>
+        <w:t xml:space="preserve">Server-Sent Events (SSE) em `/api/events`:</w:t>
       </w:r>
       <w:r>
         <w:rPr>
-          <w:rFonts w:ascii="Calibri" w:hAnsi="Calibri" w:eastAsia="Calibri"/>
-          <w:b w:val="0"/>
           <w:color w:val="333333"/>
           <w:sz w:val="22"/>
         </w:rPr>
-        <w:t xml:space="preserve">Outros motivos (com preenchimento obrigatÃ³rio da justificativa)</w:t>
-      </w:r>
-    </w:p>
-    <w:p>
-      <w:pPr>
-        <w:spacing w:after="120" w:line="276" w:lineRule="auto"/>
-      </w:pPr>
-      <w:r>
-        <w:rPr>
-          <w:rFonts w:ascii="Calibri" w:hAnsi="Calibri" w:eastAsia="Calibri"/>
-          <w:b w:val="0"/>
-          <w:color w:val="333333"/>
-          <w:sz w:val="22"/>
-        </w:rPr>
-        <w:t xml:space="preserve">Comportamento SistÃªmico de ReversÃ£o AutomÃ¡tica: Ao registrar o insucesso atravÃ©s do endpoint /api/logistics/orders/:oid/fail, o servidor executa uma rotina transacional que:</w:t>
+        <w:t xml:space="preserve"> O backend mantém um pool de conexões persistentes com heartbeat periódico a cada 25 segundos.</w:t>
       </w:r>
     </w:p>
     <w:p>
       <w:pPr>
         <w:pStyle w:val="ListBullet"/>
-        <w:spacing w:after="80" w:line="260" w:lineRule="auto"/>
+        <w:spacing w:after="60" w:line="240" w:lineRule="auto"/>
       </w:pPr>
       <w:r>
         <w:rPr>
-          <w:rFonts w:ascii="Calibri" w:hAnsi="Calibri" w:eastAsia="Calibri"/>
           <w:b/>
           <w:color w:val="061A4F"/>
           <w:sz w:val="22"/>
         </w:rPr>
-        <w:t xml:space="preserve">a) </w:t>
+        <w:t xml:space="preserve">Filtragem de Eventos por Perfil (RBAC):</w:t>
       </w:r>
       <w:r>
         <w:rPr>
-          <w:rFonts w:ascii="Calibri" w:hAnsi="Calibri" w:eastAsia="Calibri"/>
-          <w:b w:val="0"/>
           <w:color w:val="333333"/>
           <w:sz w:val="22"/>
         </w:rPr>
-        <w:t xml:space="preserve">Retorna o pedido imediatamente para o status 'SEPARACAO' na Torre de Controle;</w:t>
+        <w:t xml:space="preserve"> Cada conexão recebe exclusivamente os eventos pertinentes ao seu papel:</w:t>
       </w:r>
     </w:p>
     <w:p>
       <w:pPr>
         <w:pStyle w:val="ListBullet"/>
-        <w:spacing w:after="80" w:line="260" w:lineRule="auto"/>
+        <w:spacing w:after="60" w:line="240" w:lineRule="auto"/>
       </w:pPr>
       <w:r>
         <w:rPr>
-          <w:rFonts w:ascii="Calibri" w:hAnsi="Calibri" w:eastAsia="Calibri"/>
-          <w:b/>
-          <w:color w:val="061A4F"/>
+          <w:color w:val="333333"/>
           <w:sz w:val="22"/>
         </w:rPr>
-        <w:t xml:space="preserve">b) </w:t>
+        <w:t xml:space="preserve">*Motoristas:* </w:t>
       </w:r>
       <w:r>
         <w:rPr>
-          <w:rFonts w:ascii="Calibri" w:hAnsi="Calibri" w:eastAsia="Calibri"/>
-          <w:b w:val="0"/>
+          <w:rFonts w:ascii="Consolas" w:hAnsi="Consolas"/>
+          <w:color w:val="C7254E"/>
+          <w:shd w:val="clear" w:color="auto" w:fill="F9F2F4"/>
+          <w:sz w:val="20"/>
+        </w:rPr>
+        <w:t xml:space="preserve">routes_changed</w:t>
+      </w:r>
+      <w:r>
+        <w:rPr>
           <w:color w:val="333333"/>
           <w:sz w:val="22"/>
         </w:rPr>
-        <w:t xml:space="preserve">Desvincula o pedido da rota atual, deixando-o livre e disponÃ­vel para inclusÃ£o em novas listas de carregamento;</w:t>
+        <w:t xml:space="preserve">, </w:t>
+      </w:r>
+      <w:r>
+        <w:rPr>
+          <w:rFonts w:ascii="Consolas" w:hAnsi="Consolas"/>
+          <w:color w:val="C7254E"/>
+          <w:shd w:val="clear" w:color="auto" w:fill="F9F2F4"/>
+          <w:sz w:val="20"/>
+        </w:rPr>
+        <w:t xml:space="preserve">orders_changed</w:t>
+      </w:r>
+      <w:r>
+        <w:rPr>
+          <w:color w:val="333333"/>
+          <w:sz w:val="22"/>
+        </w:rPr>
+        <w:t xml:space="preserve">, </w:t>
+      </w:r>
+      <w:r>
+        <w:rPr>
+          <w:rFonts w:ascii="Consolas" w:hAnsi="Consolas"/>
+          <w:color w:val="C7254E"/>
+          <w:shd w:val="clear" w:color="auto" w:fill="F9F2F4"/>
+          <w:sz w:val="20"/>
+        </w:rPr>
+        <w:t xml:space="preserve">returns_changed</w:t>
+      </w:r>
+      <w:r>
+        <w:rPr>
+          <w:color w:val="333333"/>
+          <w:sz w:val="22"/>
+        </w:rPr>
+        <w:t xml:space="preserve">.</w:t>
       </w:r>
     </w:p>
     <w:p>
       <w:pPr>
         <w:pStyle w:val="ListBullet"/>
-        <w:spacing w:after="80" w:line="260" w:lineRule="auto"/>
+        <w:spacing w:after="60" w:line="240" w:lineRule="auto"/>
       </w:pPr>
       <w:r>
         <w:rPr>
-          <w:rFonts w:ascii="Calibri" w:hAnsi="Calibri" w:eastAsia="Calibri"/>
-          <w:b/>
-          <w:color w:val="061A4F"/>
+          <w:color w:val="333333"/>
           <w:sz w:val="22"/>
         </w:rPr>
-        <w:t xml:space="preserve">c) </w:t>
+        <w:t xml:space="preserve">*Vendedores:* </w:t>
       </w:r>
       <w:r>
         <w:rPr>
-          <w:rFonts w:ascii="Calibri" w:hAnsi="Calibri" w:eastAsia="Calibri"/>
-          <w:b w:val="0"/>
+          <w:rFonts w:ascii="Consolas" w:hAnsi="Consolas"/>
+          <w:color w:val="C7254E"/>
+          <w:shd w:val="clear" w:color="auto" w:fill="F9F2F4"/>
+          <w:sz w:val="20"/>
+        </w:rPr>
+        <w:t xml:space="preserve">stock_changed</w:t>
+      </w:r>
+      <w:r>
+        <w:rPr>
           <w:color w:val="333333"/>
           <w:sz w:val="22"/>
         </w:rPr>
-        <w:t xml:space="preserve">Restaura os indicadores operacionais da rota e da expediÃ§Ã£o, decrementando os contadores de entrega pendente daquela viagem;</w:t>
+        <w:t xml:space="preserve">, </w:t>
+      </w:r>
+      <w:r>
+        <w:rPr>
+          <w:rFonts w:ascii="Consolas" w:hAnsi="Consolas"/>
+          <w:color w:val="C7254E"/>
+          <w:shd w:val="clear" w:color="auto" w:fill="F9F2F4"/>
+          <w:sz w:val="20"/>
+        </w:rPr>
+        <w:t xml:space="preserve">products_changed</w:t>
+      </w:r>
+      <w:r>
+        <w:rPr>
+          <w:color w:val="333333"/>
+          <w:sz w:val="22"/>
+        </w:rPr>
+        <w:t xml:space="preserve">, </w:t>
+      </w:r>
+      <w:r>
+        <w:rPr>
+          <w:rFonts w:ascii="Consolas" w:hAnsi="Consolas"/>
+          <w:color w:val="C7254E"/>
+          <w:shd w:val="clear" w:color="auto" w:fill="F9F2F4"/>
+          <w:sz w:val="20"/>
+        </w:rPr>
+        <w:t xml:space="preserve">clients_changed</w:t>
+      </w:r>
+      <w:r>
+        <w:rPr>
+          <w:color w:val="333333"/>
+          <w:sz w:val="22"/>
+        </w:rPr>
+        <w:t xml:space="preserve">, </w:t>
+      </w:r>
+      <w:r>
+        <w:rPr>
+          <w:rFonts w:ascii="Consolas" w:hAnsi="Consolas"/>
+          <w:color w:val="C7254E"/>
+          <w:shd w:val="clear" w:color="auto" w:fill="F9F2F4"/>
+          <w:sz w:val="20"/>
+        </w:rPr>
+        <w:t xml:space="preserve">orders_changed</w:t>
+      </w:r>
+      <w:r>
+        <w:rPr>
+          <w:color w:val="333333"/>
+          <w:sz w:val="22"/>
+        </w:rPr>
+        <w:t xml:space="preserve">, </w:t>
+      </w:r>
+      <w:r>
+        <w:rPr>
+          <w:rFonts w:ascii="Consolas" w:hAnsi="Consolas"/>
+          <w:color w:val="C7254E"/>
+          <w:shd w:val="clear" w:color="auto" w:fill="F9F2F4"/>
+          <w:sz w:val="20"/>
+        </w:rPr>
+        <w:t xml:space="preserve">prices_changed</w:t>
+      </w:r>
+      <w:r>
+        <w:rPr>
+          <w:color w:val="333333"/>
+          <w:sz w:val="22"/>
+        </w:rPr>
+        <w:t xml:space="preserve">, </w:t>
+      </w:r>
+      <w:r>
+        <w:rPr>
+          <w:rFonts w:ascii="Consolas" w:hAnsi="Consolas"/>
+          <w:color w:val="C7254E"/>
+          <w:shd w:val="clear" w:color="auto" w:fill="F9F2F4"/>
+          <w:sz w:val="20"/>
+        </w:rPr>
+        <w:t xml:space="preserve">returns_changed</w:t>
+      </w:r>
+      <w:r>
+        <w:rPr>
+          <w:color w:val="333333"/>
+          <w:sz w:val="22"/>
+        </w:rPr>
+        <w:t xml:space="preserve">, </w:t>
+      </w:r>
+      <w:r>
+        <w:rPr>
+          <w:rFonts w:ascii="Consolas" w:hAnsi="Consolas"/>
+          <w:color w:val="C7254E"/>
+          <w:shd w:val="clear" w:color="auto" w:fill="F9F2F4"/>
+          <w:sz w:val="20"/>
+        </w:rPr>
+        <w:t xml:space="preserve">routes_changed</w:t>
+      </w:r>
+      <w:r>
+        <w:rPr>
+          <w:color w:val="333333"/>
+          <w:sz w:val="22"/>
+        </w:rPr>
+        <w:t xml:space="preserve">.</w:t>
       </w:r>
     </w:p>
     <w:p>
       <w:pPr>
         <w:pStyle w:val="ListBullet"/>
-        <w:spacing w:after="80" w:line="260" w:lineRule="auto"/>
+        <w:spacing w:after="60" w:line="240" w:lineRule="auto"/>
       </w:pPr>
       <w:r>
         <w:rPr>
-          <w:rFonts w:ascii="Calibri" w:hAnsi="Calibri" w:eastAsia="Calibri"/>
-          <w:b/>
-          <w:color w:val="061A4F"/>
+          <w:color w:val="333333"/>
           <w:sz w:val="22"/>
         </w:rPr>
-        <w:t xml:space="preserve">d) </w:t>
+        <w:t xml:space="preserve">*Caixas:* </w:t>
       </w:r>
       <w:r>
         <w:rPr>
-          <w:rFonts w:ascii="Calibri" w:hAnsi="Calibri" w:eastAsia="Calibri"/>
-          <w:b w:val="0"/>
+          <w:rFonts w:ascii="Consolas" w:hAnsi="Consolas"/>
+          <w:color w:val="C7254E"/>
+          <w:shd w:val="clear" w:color="auto" w:fill="F9F2F4"/>
+          <w:sz w:val="20"/>
+        </w:rPr>
+        <w:t xml:space="preserve">stock_changed</w:t>
+      </w:r>
+      <w:r>
+        <w:rPr>
           <w:color w:val="333333"/>
           <w:sz w:val="22"/>
         </w:rPr>
-        <w:t xml:space="preserve">Registra a ocorrÃªncia na tabela de retornos e dispara evento SSE atualizando no mesmo segundo o painel 'Pedidos que Retornaram' na Torre de Controle.</w:t>
+        <w:t xml:space="preserve">, </w:t>
       </w:r>
-    </w:p>
-    <w:p>
-      <w:pPr>
-        <w:spacing w:before="240" w:after="160"/>
-      </w:pPr>
       <w:r>
         <w:rPr>
-          <w:rFonts w:ascii="Calibri" w:hAnsi="Calibri" w:eastAsia="Calibri"/>
-          <w:b/>
-          <w:color w:val="061A4F"/>
-          <w:sz w:val="36"/>
+          <w:rFonts w:ascii="Consolas" w:hAnsi="Consolas"/>
+          <w:color w:val="C7254E"/>
+          <w:shd w:val="clear" w:color="auto" w:fill="F9F2F4"/>
+          <w:sz w:val="20"/>
         </w:rPr>
-        <w:t>6. Boas PrÃ¡ticas, SeguranÃ§a e Encerramento de Turno</w:t>
+        <w:t xml:space="preserve">products_changed</w:t>
       </w:r>
-    </w:p>
-    <w:p>
-      <w:pPr>
-        <w:spacing w:after="120" w:line="276" w:lineRule="auto"/>
-      </w:pPr>
       <w:r>
         <w:rPr>
-          <w:rFonts w:ascii="Calibri" w:hAnsi="Calibri" w:eastAsia="Calibri"/>
-          <w:b w:val="0"/>
           <w:color w:val="333333"/>
           <w:sz w:val="22"/>
         </w:rPr>
-        <w:t xml:space="preserve">Para garantir a confiabilidade operacional e a integridade dos dados, todo colaborador deve adotar as seguintes prÃ¡ticas:</w:t>
+        <w:t xml:space="preserve">, </w:t>
+      </w:r>
+      <w:r>
+        <w:rPr>
+          <w:rFonts w:ascii="Consolas" w:hAnsi="Consolas"/>
+          <w:color w:val="C7254E"/>
+          <w:shd w:val="clear" w:color="auto" w:fill="F9F2F4"/>
+          <w:sz w:val="20"/>
+        </w:rPr>
+        <w:t xml:space="preserve">orders_changed</w:t>
+      </w:r>
+      <w:r>
+        <w:rPr>
+          <w:color w:val="333333"/>
+          <w:sz w:val="22"/>
+        </w:rPr>
+        <w:t xml:space="preserve">, </w:t>
+      </w:r>
+      <w:r>
+        <w:rPr>
+          <w:rFonts w:ascii="Consolas" w:hAnsi="Consolas"/>
+          <w:color w:val="C7254E"/>
+          <w:shd w:val="clear" w:color="auto" w:fill="F9F2F4"/>
+          <w:sz w:val="20"/>
+        </w:rPr>
+        <w:t xml:space="preserve">prices_changed</w:t>
+      </w:r>
+      <w:r>
+        <w:rPr>
+          <w:color w:val="333333"/>
+          <w:sz w:val="22"/>
+        </w:rPr>
+        <w:t xml:space="preserve">, </w:t>
+      </w:r>
+      <w:r>
+        <w:rPr>
+          <w:rFonts w:ascii="Consolas" w:hAnsi="Consolas"/>
+          <w:color w:val="C7254E"/>
+          <w:shd w:val="clear" w:color="auto" w:fill="F9F2F4"/>
+          <w:sz w:val="20"/>
+        </w:rPr>
+        <w:t xml:space="preserve">clients_changed</w:t>
+      </w:r>
+      <w:r>
+        <w:rPr>
+          <w:color w:val="333333"/>
+          <w:sz w:val="22"/>
+        </w:rPr>
+        <w:t xml:space="preserve">.</w:t>
       </w:r>
     </w:p>
     <w:p>
       <w:pPr>
         <w:pStyle w:val="ListBullet"/>
-        <w:spacing w:after="80" w:line="260" w:lineRule="auto"/>
+        <w:spacing w:after="60" w:line="240" w:lineRule="auto"/>
       </w:pPr>
       <w:r>
         <w:rPr>
-          <w:rFonts w:ascii="Calibri" w:hAnsi="Calibri" w:eastAsia="Calibri"/>
-          <w:b/>
-          <w:color w:val="061A4F"/>
-          <w:sz w:val="22"/>
-        </w:rPr>
-        <w:t xml:space="preserve">â€¢ Credenciais Pessoais e IntransferÃ­veis: </w:t>
-      </w:r>
-      <w:r>
-        <w:rPr>
-          <w:rFonts w:ascii="Calibri" w:hAnsi="Calibri" w:eastAsia="Calibri"/>
-          <w:b w:val="0"/>
           <w:color w:val="333333"/>
           <w:sz w:val="22"/>
         </w:rPr>
-        <w:t xml:space="preserve">O acesso deve ser sempre realizado com usuÃ¡rio e senha prÃ³prios. O compartilhamento de senhas viola as polÃ­ticas de seguranÃ§a corporativa e a rastreabilidade da auditoria.</w:t>
+        <w:t xml:space="preserve">*Administradores:* Todos os eventos globais de auditoria, vendas, estoque e logística.</w:t>
       </w:r>
     </w:p>
     <w:p>
       <w:pPr>
         <w:pStyle w:val="ListBullet"/>
-        <w:spacing w:after="80" w:line="260" w:lineRule="auto"/>
+        <w:spacing w:after="60" w:line="240" w:lineRule="auto"/>
       </w:pPr>
       <w:r>
         <w:rPr>
-          <w:rFonts w:ascii="Calibri" w:hAnsi="Calibri" w:eastAsia="Calibri"/>
           <w:b/>
           <w:color w:val="061A4F"/>
           <w:sz w:val="22"/>
         </w:rPr>
-        <w:t xml:space="preserve">â€¢ ProteÃ§Ã£o e Privacidade de Dados (LGPD): </w:t>
+        <w:t xml:space="preserve">BroadcastChannel no Navegador:</w:t>
       </w:r>
       <w:r>
         <w:rPr>
-          <w:rFonts w:ascii="Calibri" w:hAnsi="Calibri" w:eastAsia="Calibri"/>
-          <w:b w:val="0"/>
           <w:color w:val="333333"/>
           <w:sz w:val="22"/>
         </w:rPr>
-        <w:t xml:space="preserve">Dados pessoais de clientes, endereÃ§os e comprovantes de entrega constituem informaÃ§Ãµes confidenciais e devem ser tratados estritamente no Ã¢mbito da prestaÃ§Ã£o do serviÃ§o.</w:t>
+        <w:t xml:space="preserve"> Interfaces com múltiplas abas sincronizam dados localmente na memória do dispositivo.</w:t>
       </w:r>
     </w:p>
     <w:p>
       <w:pPr>
         <w:pStyle w:val="ListBullet"/>
-        <w:spacing w:after="80" w:line="260" w:lineRule="auto"/>
+        <w:spacing w:after="60" w:line="240" w:lineRule="auto"/>
       </w:pPr>
       <w:r>
         <w:rPr>
-          <w:rFonts w:ascii="Calibri" w:hAnsi="Calibri" w:eastAsia="Calibri"/>
           <w:b/>
           <w:color w:val="061A4F"/>
           <w:sz w:val="22"/>
         </w:rPr>
-        <w:t xml:space="preserve">â€¢ Fechamento e ConciliaÃ§Ã£o de Caixa: </w:t>
+        <w:t xml:space="preserve">Efeito Visual Flash:</w:t>
       </w:r>
       <w:r>
         <w:rPr>
-          <w:rFonts w:ascii="Calibri" w:hAnsi="Calibri" w:eastAsia="Calibri"/>
-          <w:b w:val="0"/>
           <w:color w:val="333333"/>
           <w:sz w:val="22"/>
         </w:rPr>
-        <w:t xml:space="preserve">Ao final de cada expediente, o operador de caixa deve realizar a sangria e confrontar os valores fÃ­sicos e comprovantes de cartÃµes com o relatÃ³rio financeiro do PDV.</w:t>
+        <w:t xml:space="preserve"> Ao receber mutações de pedidos ou estoque, os contadores e cards da Torre de Controle pulsam suavemente para destacar a mudança em tempo real.</w:t>
+      </w:r>
+    </w:p>
+    <w:p>
+      <w:pPr>
+        <w:pStyle w:val="Heading2"/>
+        <w:spacing w:before="220" w:after="100"/>
+      </w:pPr>
+      <w:r>
+        <w:rPr>
+          <w:b/>
+          <w:color w:val="FD5E02"/>
+          <w:sz w:val="26"/>
+        </w:rPr>
+        <w:t xml:space="preserve">4. BASE DE DADOS HOMOLOGADA E ESTADO ATUAL DO SISTEMA</w:t>
+      </w:r>
+    </w:p>
+    <w:p>
+      <w:pPr>
+        <w:spacing w:after="120" w:line="260" w:lineRule="auto"/>
+      </w:pPr>
+      <w:r>
+        <w:rPr>
+          <w:color w:val="333333"/>
+          <w:sz w:val="22"/>
+        </w:rPr>
+        <w:t xml:space="preserve">A base de dados do sistema opera em SQLite nativo sob o arquivo </w:t>
+      </w:r>
+      <w:r>
+        <w:rPr>
+          <w:rFonts w:ascii="Consolas" w:hAnsi="Consolas"/>
+          <w:color w:val="C7254E"/>
+          <w:shd w:val="clear" w:color="auto" w:fill="F9F2F4"/>
+          <w:sz w:val="20"/>
+        </w:rPr>
+        <w:t xml:space="preserve">xiquim-vargas.db</w:t>
+      </w:r>
+      <w:r>
+        <w:rPr>
+          <w:color w:val="333333"/>
+          <w:sz w:val="22"/>
+        </w:rPr>
+        <w:t xml:space="preserve"> em modo Write-Ahead Logging (WAL) com chaves estrangeiras ativas e transações ACID:</w:t>
       </w:r>
     </w:p>
     <w:p>
       <w:pPr>
         <w:pStyle w:val="ListBullet"/>
-        <w:spacing w:after="80" w:line="260" w:lineRule="auto"/>
+        <w:spacing w:after="60" w:line="240" w:lineRule="auto"/>
       </w:pPr>
       <w:r>
         <w:rPr>
-          <w:rFonts w:ascii="Calibri" w:hAnsi="Calibri" w:eastAsia="Calibri"/>
           <w:b/>
           <w:color w:val="061A4F"/>
           <w:sz w:val="22"/>
         </w:rPr>
-        <w:t xml:space="preserve">â€¢ Triagem DiÃ¡ria de Retornos LogÃ­sticos: </w:t>
+        <w:t xml:space="preserve">620 Produtos Ativos (628 Cadastrados):</w:t>
       </w:r>
       <w:r>
         <w:rPr>
-          <w:rFonts w:ascii="Calibri" w:hAnsi="Calibri" w:eastAsia="Calibri"/>
-          <w:b w:val="0"/>
           <w:color w:val="333333"/>
           <w:sz w:val="22"/>
         </w:rPr>
-        <w:t xml:space="preserve">A equipe de expediÃ§Ã£o deve realizar a triagem fÃ­sica de todos os itens retornados pelos motoristas ao tÃ©rmino de cada turno, confirmando o estado dos produtos e definindo o reembarque prioritÃ¡rio.</w:t>
+        <w:t xml:space="preserve"> Cadastro completo com SKU, descrição, marca, sabor, tamanho, unidade e fotos oficiais.</w:t>
+      </w:r>
+    </w:p>
+    <w:p>
+      <w:pPr>
+        <w:pStyle w:val="ListBullet"/>
+        <w:spacing w:after="60" w:line="240" w:lineRule="auto"/>
+      </w:pPr>
+      <w:r>
+        <w:rPr>
+          <w:b/>
+          <w:color w:val="061A4F"/>
+          <w:sz w:val="22"/>
+        </w:rPr>
+        <w:t xml:space="preserve">1.236.986 Unidades em Estoque:</w:t>
+      </w:r>
+      <w:r>
+        <w:rPr>
+          <w:color w:val="333333"/>
+          <w:sz w:val="22"/>
+        </w:rPr>
+        <w:t xml:space="preserve"> Distribuição média de ~2.000 unidades disponíveis por produto, com controle rigoroso de saldo reservado (2.525 unidades atualmente vinculadas a pedidos em andamento).</w:t>
+      </w:r>
+    </w:p>
+    <w:p>
+      <w:pPr>
+        <w:pStyle w:val="ListBullet"/>
+        <w:spacing w:after="60" w:line="240" w:lineRule="auto"/>
+      </w:pPr>
+      <w:r>
+        <w:rPr>
+          <w:b/>
+          <w:color w:val="061A4F"/>
+          <w:sz w:val="22"/>
+        </w:rPr>
+        <w:t xml:space="preserve">Estrutura de Perfis Operacionais (Roles) e Credenciais Seguras:</w:t>
+      </w:r>
+      <w:r>
+        <w:rPr>
+          <w:color w:val="333333"/>
+          <w:sz w:val="22"/>
+        </w:rPr>
+        <w:t xml:space="preserve"> O sistema opera com isolamento de acessos e senhas protegidas via criptografia </w:t>
+      </w:r>
+      <w:r>
+        <w:rPr>
+          <w:rFonts w:ascii="Consolas" w:hAnsi="Consolas"/>
+          <w:color w:val="C7254E"/>
+          <w:shd w:val="clear" w:color="auto" w:fill="F9F2F4"/>
+          <w:sz w:val="20"/>
+        </w:rPr>
+        <w:t xml:space="preserve">scrypt</w:t>
+      </w:r>
+      <w:r>
+        <w:rPr>
+          <w:color w:val="333333"/>
+          <w:sz w:val="22"/>
+        </w:rPr>
+        <w:t xml:space="preserve"> com salt pseudoaleatório de 16 bytes. Cada perfil funcional foi concebido para atender com máxima agilidade ao seu escopo de atuação:</w:t>
+      </w:r>
+    </w:p>
+    <w:p>
+      <w:pPr>
+        <w:pStyle w:val="ListBullet"/>
+        <w:spacing w:after="60" w:line="240" w:lineRule="auto"/>
+      </w:pPr>
+      <w:r>
+        <w:rPr>
+          <w:b/>
+          <w:color w:val="061A4F"/>
+          <w:sz w:val="22"/>
+        </w:rPr>
+        <w:t xml:space="preserve">Administrador (`admin`):</w:t>
+      </w:r>
+      <w:r>
+        <w:rPr>
+          <w:color w:val="333333"/>
+          <w:sz w:val="22"/>
+        </w:rPr>
+        <w:t xml:space="preserve"> Gestão central na Torre de Controle (</w:t>
+      </w:r>
+      <w:r>
+        <w:rPr>
+          <w:rFonts w:ascii="Consolas" w:hAnsi="Consolas"/>
+          <w:color w:val="C7254E"/>
+          <w:shd w:val="clear" w:color="auto" w:fill="F9F2F4"/>
+          <w:sz w:val="20"/>
+        </w:rPr>
+        <w:t xml:space="preserve">admin.html</w:t>
+      </w:r>
+      <w:r>
+        <w:rPr>
+          <w:color w:val="333333"/>
+          <w:sz w:val="22"/>
+        </w:rPr>
+        <w:t xml:space="preserve"> e APK </w:t>
+      </w:r>
+      <w:r>
+        <w:rPr>
+          <w:rFonts w:ascii="Consolas" w:hAnsi="Consolas"/>
+          <w:color w:val="C7254E"/>
+          <w:shd w:val="clear" w:color="auto" w:fill="F9F2F4"/>
+          <w:sz w:val="20"/>
+        </w:rPr>
+        <w:t xml:space="preserve">XiquimVargas-TorreControle</w:t>
+      </w:r>
+      <w:r>
+        <w:rPr>
+          <w:color w:val="333333"/>
+          <w:sz w:val="22"/>
+        </w:rPr>
+        <w:t xml:space="preserve">). Possui autoridade irrestrita para cadastrar produtos, definir preços e tabelas, gerenciar compras com fornecedores, acompanhar auditoria, liberar cargas e despachar rotas de entrega.</w:t>
+      </w:r>
+    </w:p>
+    <w:p>
+      <w:pPr>
+        <w:pStyle w:val="ListBullet"/>
+        <w:spacing w:after="60" w:line="240" w:lineRule="auto"/>
+      </w:pPr>
+      <w:r>
+        <w:rPr>
+          <w:b/>
+          <w:color w:val="061A4F"/>
+          <w:sz w:val="22"/>
+        </w:rPr>
+        <w:t xml:space="preserve">Vendedor Externo (`seller`):</w:t>
+      </w:r>
+      <w:r>
+        <w:rPr>
+          <w:color w:val="333333"/>
+          <w:sz w:val="22"/>
+        </w:rPr>
+        <w:t xml:space="preserve"> Opera pelo aplicativo móvel </w:t>
+      </w:r>
+      <w:r>
+        <w:rPr>
+          <w:rFonts w:ascii="Consolas" w:hAnsi="Consolas"/>
+          <w:color w:val="C7254E"/>
+          <w:shd w:val="clear" w:color="auto" w:fill="F9F2F4"/>
+          <w:sz w:val="20"/>
+        </w:rPr>
+        <w:t xml:space="preserve">XiquimVargas-Vendedor</w:t>
+      </w:r>
+      <w:r>
+        <w:rPr>
+          <w:color w:val="333333"/>
+          <w:sz w:val="22"/>
+        </w:rPr>
+        <w:t xml:space="preserve"> ou </w:t>
+      </w:r>
+      <w:r>
+        <w:rPr>
+          <w:rFonts w:ascii="Consolas" w:hAnsi="Consolas"/>
+          <w:color w:val="C7254E"/>
+          <w:shd w:val="clear" w:color="auto" w:fill="F9F2F4"/>
+          <w:sz w:val="20"/>
+        </w:rPr>
+        <w:t xml:space="preserve">vendedor.html</w:t>
+      </w:r>
+      <w:r>
+        <w:rPr>
+          <w:color w:val="333333"/>
+          <w:sz w:val="22"/>
+        </w:rPr>
+        <w:t xml:space="preserve">. Acessa o catálogo com fotos e preços dinâmicos, visualiza as metas do mês, gerencia clientes vinculados à sua carteira e emite pedidos mesmo sem internet (salvos localmente na outbox para envio automático posterior).</w:t>
+      </w:r>
+    </w:p>
+    <w:p>
+      <w:pPr>
+        <w:pStyle w:val="ListBullet"/>
+        <w:spacing w:after="60" w:line="240" w:lineRule="auto"/>
+      </w:pPr>
+      <w:r>
+        <w:rPr>
+          <w:b/>
+          <w:color w:val="061A4F"/>
+          <w:sz w:val="22"/>
+        </w:rPr>
+        <w:t xml:space="preserve">Operador de Caixa (`cashier`):</w:t>
+      </w:r>
+      <w:r>
+        <w:rPr>
+          <w:color w:val="333333"/>
+          <w:sz w:val="22"/>
+        </w:rPr>
+        <w:t xml:space="preserve"> Opera no terminal de frente de caixa </w:t>
+      </w:r>
+      <w:r>
+        <w:rPr>
+          <w:rFonts w:ascii="Consolas" w:hAnsi="Consolas"/>
+          <w:color w:val="C7254E"/>
+          <w:shd w:val="clear" w:color="auto" w:fill="F9F2F4"/>
+          <w:sz w:val="20"/>
+        </w:rPr>
+        <w:t xml:space="preserve">XiquimVargas-PDV</w:t>
+      </w:r>
+      <w:r>
+        <w:rPr>
+          <w:color w:val="333333"/>
+          <w:sz w:val="22"/>
+        </w:rPr>
+        <w:t xml:space="preserve"> / </w:t>
+      </w:r>
+      <w:r>
+        <w:rPr>
+          <w:rFonts w:ascii="Consolas" w:hAnsi="Consolas"/>
+          <w:color w:val="C7254E"/>
+          <w:shd w:val="clear" w:color="auto" w:fill="F9F2F4"/>
+          <w:sz w:val="20"/>
+        </w:rPr>
+        <w:t xml:space="preserve">XiquimVargas-Caixa</w:t>
+      </w:r>
+      <w:r>
+        <w:rPr>
+          <w:color w:val="333333"/>
+          <w:sz w:val="22"/>
+        </w:rPr>
+        <w:t xml:space="preserve"> ou </w:t>
+      </w:r>
+      <w:r>
+        <w:rPr>
+          <w:rFonts w:ascii="Consolas" w:hAnsi="Consolas"/>
+          <w:color w:val="C7254E"/>
+          <w:shd w:val="clear" w:color="auto" w:fill="F9F2F4"/>
+          <w:sz w:val="20"/>
+        </w:rPr>
+        <w:t xml:space="preserve">pdv.html</w:t>
+      </w:r>
+      <w:r>
+        <w:rPr>
+          <w:color w:val="333333"/>
+          <w:sz w:val="22"/>
+        </w:rPr>
+        <w:t xml:space="preserve">. Focado em agilidade no balcão presencial: realiza bipagem com leitor de código de barras, registra múltiplos meios de pagamento (Dinheiro com cálculo de troco, Débito, Crédito à vista ou parcelado, PIX), emite comprovantes térmicos e utiliza o cliente padrão pré-cadastrado </w:t>
+      </w:r>
+      <w:r>
+        <w:rPr>
+          <w:rFonts w:ascii="Consolas" w:hAnsi="Consolas"/>
+          <w:color w:val="C7254E"/>
+          <w:shd w:val="clear" w:color="auto" w:fill="F9F2F4"/>
+          <w:sz w:val="20"/>
+        </w:rPr>
+        <w:t xml:space="preserve">CLIENTE-BALCAO</w:t>
+      </w:r>
+      <w:r>
+        <w:rPr>
+          <w:color w:val="333333"/>
+          <w:sz w:val="22"/>
+        </w:rPr>
+        <w:t xml:space="preserve"> (Consumidor Final) para vendas rápidas sem necessidade de cadastro burocrático.</w:t>
+      </w:r>
+    </w:p>
+    <w:p>
+      <w:pPr>
+        <w:pStyle w:val="ListBullet"/>
+        <w:spacing w:after="60" w:line="240" w:lineRule="auto"/>
+      </w:pPr>
+      <w:r>
+        <w:rPr>
+          <w:b/>
+          <w:color w:val="061A4F"/>
+          <w:sz w:val="22"/>
+        </w:rPr>
+        <w:t xml:space="preserve">Motorista de Entregas (`driver`):</w:t>
+      </w:r>
+      <w:r>
+        <w:rPr>
+          <w:color w:val="333333"/>
+          <w:sz w:val="22"/>
+        </w:rPr>
+        <w:t xml:space="preserve"> Opera pelo aplicativo móvel </w:t>
+      </w:r>
+      <w:r>
+        <w:rPr>
+          <w:rFonts w:ascii="Consolas" w:hAnsi="Consolas"/>
+          <w:color w:val="C7254E"/>
+          <w:shd w:val="clear" w:color="auto" w:fill="F9F2F4"/>
+          <w:sz w:val="20"/>
+        </w:rPr>
+        <w:t xml:space="preserve">XiquimVargas-Motorista</w:t>
+      </w:r>
+      <w:r>
+        <w:rPr>
+          <w:color w:val="333333"/>
+          <w:sz w:val="22"/>
+        </w:rPr>
+        <w:t xml:space="preserve"> ou </w:t>
+      </w:r>
+      <w:r>
+        <w:rPr>
+          <w:rFonts w:ascii="Consolas" w:hAnsi="Consolas"/>
+          <w:color w:val="C7254E"/>
+          <w:shd w:val="clear" w:color="auto" w:fill="F9F2F4"/>
+          <w:sz w:val="20"/>
+        </w:rPr>
+        <w:t xml:space="preserve">motorista.html</w:t>
+      </w:r>
+      <w:r>
+        <w:rPr>
+          <w:color w:val="333333"/>
+          <w:sz w:val="22"/>
+        </w:rPr>
+        <w:t xml:space="preserve">. Visualiza a sequência de paradas atribuídas pela expedição, aciona clientes diretamente via WhatsApp ou ligação telefônica em um clique, fotografa canhotos assinados para baixa de entrega e registra devoluções físicas com reversão automática de pedidos.</w:t>
+      </w:r>
+    </w:p>
+    <w:p>
+      <w:pPr>
+        <w:pStyle w:val="ListBullet"/>
+        <w:spacing w:after="60" w:line="240" w:lineRule="auto"/>
+      </w:pPr>
+      <w:r>
+        <w:rPr>
+          <w:b/>
+          <w:color w:val="061A4F"/>
+          <w:sz w:val="22"/>
+        </w:rPr>
+        <w:t xml:space="preserve">Cliente Web E-Commerce (`web_client`):</w:t>
+      </w:r>
+      <w:r>
+        <w:rPr>
+          <w:color w:val="333333"/>
+          <w:sz w:val="22"/>
+        </w:rPr>
+        <w:t xml:space="preserve"> Perfil de autoatendimento para clientes finais e corporativos na Loja Online (</w:t>
+      </w:r>
+      <w:r>
+        <w:rPr>
+          <w:rFonts w:ascii="Consolas" w:hAnsi="Consolas"/>
+          <w:color w:val="C7254E"/>
+          <w:shd w:val="clear" w:color="auto" w:fill="F9F2F4"/>
+          <w:sz w:val="20"/>
+        </w:rPr>
+        <w:t xml:space="preserve">loja.html</w:t>
+      </w:r>
+      <w:r>
+        <w:rPr>
+          <w:color w:val="333333"/>
+          <w:sz w:val="22"/>
+        </w:rPr>
+        <w:t xml:space="preserve">), permitindo navegação pelo catálogo, validação de estoque, montagem de carrinho, cálculo de frete por bairro e acompanhamento do status do pedido.</w:t>
+      </w:r>
+    </w:p>
+    <w:p>
+      <w:pPr>
+        <w:pStyle w:val="ListBullet"/>
+        <w:spacing w:after="60" w:line="240" w:lineRule="auto"/>
+      </w:pPr>
+      <w:r>
+        <w:rPr>
+          <w:b/>
+          <w:color w:val="061A4F"/>
+          <w:sz w:val="22"/>
+        </w:rPr>
+        <w:t xml:space="preserve">Cadastro de Clientes e Cliente Balcão Padrão:</w:t>
+      </w:r>
+      <w:r>
+        <w:rPr>
+          <w:color w:val="333333"/>
+          <w:sz w:val="22"/>
+        </w:rPr>
+        <w:t xml:space="preserve"> Gestão comercial com dados cadastrais completos (endereço, bairro, CNPJ/CPF, telefone, tabela de preços e vendedor responsável), incluindo o registro nativo </w:t>
+      </w:r>
+      <w:r>
+        <w:rPr>
+          <w:rFonts w:ascii="Consolas" w:hAnsi="Consolas"/>
+          <w:color w:val="C7254E"/>
+          <w:shd w:val="clear" w:color="auto" w:fill="F9F2F4"/>
+          <w:sz w:val="20"/>
+        </w:rPr>
+        <w:t xml:space="preserve">CLIENTE-BALCAO</w:t>
+      </w:r>
+      <w:r>
+        <w:rPr>
+          <w:color w:val="333333"/>
+          <w:sz w:val="22"/>
+        </w:rPr>
+        <w:t xml:space="preserve"> ("Consumidor Final") mantido para viabilizar faturamentos imediatos de balcão sem burocracia.</w:t>
+      </w:r>
+    </w:p>
+    <w:p>
+      <w:pPr>
+        <w:pStyle w:val="ListBullet"/>
+        <w:spacing w:after="60" w:line="240" w:lineRule="auto"/>
+      </w:pPr>
+      <w:r>
+        <w:rPr>
+          <w:b/>
+          <w:color w:val="061A4F"/>
+          <w:sz w:val="22"/>
+        </w:rPr>
+        <w:t xml:space="preserve">713 Pedidos no Histórico:</w:t>
+      </w:r>
+      <w:r>
+        <w:rPr>
+          <w:color w:val="333333"/>
+          <w:sz w:val="22"/>
+        </w:rPr>
+        <w:t xml:space="preserve"> 510 concluídos, 78 pendentes, 53 em rota e 72 em separação.</w:t>
+      </w:r>
+    </w:p>
+    <w:p>
+      <w:pPr>
+        <w:pStyle w:val="ListBullet"/>
+        <w:spacing w:after="60" w:line="240" w:lineRule="auto"/>
+      </w:pPr>
+      <w:r>
+        <w:rPr>
+          <w:b/>
+          <w:color w:val="061A4F"/>
+          <w:sz w:val="22"/>
+        </w:rPr>
+        <w:t xml:space="preserve">15 Fornecedores e 47 Ordens de Compra:</w:t>
+      </w:r>
+      <w:r>
+        <w:rPr>
+          <w:color w:val="333333"/>
+          <w:sz w:val="22"/>
+        </w:rPr>
+        <w:t xml:space="preserve"> Controle integrado de suprimentos e histórico contínuo de custo de aquisição (</w:t>
+      </w:r>
+      <w:r>
+        <w:rPr>
+          <w:rFonts w:ascii="Consolas" w:hAnsi="Consolas"/>
+          <w:color w:val="C7254E"/>
+          <w:shd w:val="clear" w:color="auto" w:fill="F9F2F4"/>
+          <w:sz w:val="20"/>
+        </w:rPr>
+        <w:t xml:space="preserve">produto_custos_historico</w:t>
+      </w:r>
+      <w:r>
+        <w:rPr>
+          <w:color w:val="333333"/>
+          <w:sz w:val="22"/>
+        </w:rPr>
+        <w:t xml:space="preserve">).</w:t>
+      </w:r>
+    </w:p>
+    <w:p>
+      <w:pPr>
+        <w:pStyle w:val="Heading2"/>
+        <w:spacing w:before="220" w:after="100"/>
+      </w:pPr>
+      <w:r>
+        <w:rPr>
+          <w:b/>
+          <w:color w:val="FD5E02"/>
+          <w:sz w:val="26"/>
+        </w:rPr>
+        <w:t xml:space="preserve">5. CICLO DE VIDA DO PEDIDO E GOVERNANÇA OPERACIONAL</w:t>
+      </w:r>
+    </w:p>
+    <w:p>
+      <w:pPr>
+        <w:spacing w:after="120" w:line="260" w:lineRule="auto"/>
+      </w:pPr>
+      <w:r>
+        <w:rPr>
+          <w:color w:val="333333"/>
+          <w:sz w:val="22"/>
+        </w:rPr>
+        <w:t xml:space="preserve">O fluxo de atendimento segue uma máquina de estados estrita:</w:t>
+      </w:r>
+    </w:p>
+    <w:p>
+      <w:pPr>
+        <w:spacing w:after="60" w:line="240" w:lineRule="auto"/>
+      </w:pPr>
+      <w:r>
+        <w:rPr>
+          <w:b/>
+          <w:color w:val="FD5E02"/>
+          <w:sz w:val="22"/>
+        </w:rPr>
+        <w:t xml:space="preserve">1. </w:t>
+      </w:r>
+      <w:r>
+        <w:rPr>
+          <w:b/>
+          <w:color w:val="061A4F"/>
+          <w:sz w:val="22"/>
+        </w:rPr>
+        <w:t xml:space="preserve">PENDENTE:</w:t>
+      </w:r>
+      <w:r>
+        <w:rPr>
+          <w:color w:val="333333"/>
+          <w:sz w:val="22"/>
+        </w:rPr>
+        <w:t xml:space="preserve"> Pedido criado pelo Vendedor, Loja Online ou PDV. O estoque disponível é imediatamente decrementado e transferido para estoque reservado.</w:t>
+      </w:r>
+    </w:p>
+    <w:p>
+      <w:pPr>
+        <w:spacing w:after="60" w:line="240" w:lineRule="auto"/>
+      </w:pPr>
+      <w:r>
+        <w:rPr>
+          <w:b/>
+          <w:color w:val="FD5E02"/>
+          <w:sz w:val="22"/>
+        </w:rPr>
+        <w:t xml:space="preserve">2. </w:t>
+      </w:r>
+      <w:r>
+        <w:rPr>
+          <w:b/>
+          <w:color w:val="061A4F"/>
+          <w:sz w:val="22"/>
+        </w:rPr>
+        <w:t xml:space="preserve">SEPARACAO:</w:t>
+      </w:r>
+      <w:r>
+        <w:rPr>
+          <w:color w:val="333333"/>
+          <w:sz w:val="22"/>
+        </w:rPr>
+        <w:t xml:space="preserve"> A expedição imprime o romaneio e realiza a separação física no galpão.</w:t>
+      </w:r>
+    </w:p>
+    <w:p>
+      <w:pPr>
+        <w:spacing w:after="60" w:line="240" w:lineRule="auto"/>
+      </w:pPr>
+      <w:r>
+        <w:rPr>
+          <w:b/>
+          <w:color w:val="FD5E02"/>
+          <w:sz w:val="22"/>
+        </w:rPr>
+        <w:t xml:space="preserve">3. </w:t>
+      </w:r>
+      <w:r>
+        <w:rPr>
+          <w:b/>
+          <w:color w:val="061A4F"/>
+          <w:sz w:val="22"/>
+        </w:rPr>
+        <w:t xml:space="preserve">ROTA:</w:t>
+      </w:r>
+      <w:r>
+        <w:rPr>
+          <w:color w:val="333333"/>
+          <w:sz w:val="22"/>
+        </w:rPr>
+        <w:t xml:space="preserve"> A expedição vincula o pedido a uma rota de entrega e associa um motorista.</w:t>
+      </w:r>
+    </w:p>
+    <w:p>
+      <w:pPr>
+        <w:spacing w:after="60" w:line="240" w:lineRule="auto"/>
+      </w:pPr>
+      <w:r>
+        <w:rPr>
+          <w:b/>
+          <w:color w:val="FD5E02"/>
+          <w:sz w:val="22"/>
+        </w:rPr>
+        <w:t xml:space="preserve">4. </w:t>
+      </w:r>
+      <w:r>
+        <w:rPr>
+          <w:b/>
+          <w:color w:val="061A4F"/>
+          <w:sz w:val="22"/>
+        </w:rPr>
+        <w:t xml:space="preserve">CONCLUIDO:</w:t>
+      </w:r>
+      <w:r>
+        <w:rPr>
+          <w:color w:val="333333"/>
+          <w:sz w:val="22"/>
+        </w:rPr>
+        <w:t xml:space="preserve"> O motorista entrega a mercadoria, colhe assinatura e foto do comprovante no aplicativo, ou a Torre realiza a baixa direta expressa (</w:t>
+      </w:r>
+      <w:r>
+        <w:rPr>
+          <w:rFonts w:ascii="Consolas" w:hAnsi="Consolas"/>
+          <w:color w:val="C7254E"/>
+          <w:shd w:val="clear" w:color="auto" w:fill="F9F2F4"/>
+          <w:sz w:val="20"/>
+        </w:rPr>
+        <w:t xml:space="preserve">/api/logistics/orders/complete-direct</w:t>
+      </w:r>
+      <w:r>
+        <w:rPr>
+          <w:color w:val="333333"/>
+          <w:sz w:val="22"/>
+        </w:rPr>
+        <w:t xml:space="preserve">). O estoque reservado é baixado definitivamente como </w:t>
+      </w:r>
+      <w:r>
+        <w:rPr>
+          <w:rFonts w:ascii="Consolas" w:hAnsi="Consolas"/>
+          <w:color w:val="C7254E"/>
+          <w:shd w:val="clear" w:color="auto" w:fill="F9F2F4"/>
+          <w:sz w:val="20"/>
+        </w:rPr>
+        <w:t xml:space="preserve">SAIDA_VENDA</w:t>
+      </w:r>
+      <w:r>
+        <w:rPr>
+          <w:color w:val="333333"/>
+          <w:sz w:val="22"/>
+        </w:rPr>
+        <w:t xml:space="preserve">.</w:t>
+      </w:r>
+    </w:p>
+    <w:p>
+      <w:pPr>
+        <w:spacing w:after="60" w:line="240" w:lineRule="auto"/>
+      </w:pPr>
+      <w:r>
+        <w:rPr>
+          <w:b/>
+          <w:color w:val="FD5E02"/>
+          <w:sz w:val="22"/>
+        </w:rPr>
+        <w:t xml:space="preserve">5. </w:t>
+      </w:r>
+      <w:r>
+        <w:rPr>
+          <w:b/>
+          <w:color w:val="061A4F"/>
+          <w:sz w:val="22"/>
+        </w:rPr>
+        <w:t xml:space="preserve">CANCELADO:</w:t>
+      </w:r>
+      <w:r>
+        <w:rPr>
+          <w:color w:val="333333"/>
+          <w:sz w:val="22"/>
+        </w:rPr>
+        <w:t xml:space="preserve"> Disponível apenas para administradores. O saldo reservado é estornado integralmente para o estoque disponível.</w:t>
+      </w:r>
+    </w:p>
+    <w:p>
+      <w:pPr>
+        <w:pStyle w:val="Heading3"/>
+        <w:spacing w:before="180" w:after="80"/>
+      </w:pPr>
+      <w:r>
+        <w:rPr>
+          <w:b/>
+          <w:color w:val="061A4F"/>
+          <w:sz w:val="22"/>
+        </w:rPr>
+        <w:t xml:space="preserve">5.1 Protocolo de Insucesso Logístico e Devolução</w:t>
+      </w:r>
+    </w:p>
+    <w:p>
+      <w:pPr>
+        <w:spacing w:after="120" w:line="260" w:lineRule="auto"/>
+      </w:pPr>
+      <w:r>
+        <w:rPr>
+          <w:color w:val="333333"/>
+          <w:sz w:val="22"/>
+        </w:rPr>
+        <w:t xml:space="preserve">Quando uma entrega não pode ser realizada (cliente ausente, endereço incorreto, recusa de mercadoria):</w:t>
+      </w:r>
+    </w:p>
+    <w:p>
+      <w:pPr>
+        <w:pStyle w:val="ListBullet"/>
+        <w:spacing w:after="60" w:line="240" w:lineRule="auto"/>
+      </w:pPr>
+      <w:r>
+        <w:rPr>
+          <w:color w:val="333333"/>
+          <w:sz w:val="22"/>
+        </w:rPr>
+        <w:t xml:space="preserve">O motorista clica em </w:t>
+      </w:r>
+      <w:r>
+        <w:rPr>
+          <w:b/>
+          <w:color w:val="061A4F"/>
+          <w:sz w:val="22"/>
+        </w:rPr>
+        <w:t xml:space="preserve">"Registrar Retorno"</w:t>
+      </w:r>
+      <w:r>
+        <w:rPr>
+          <w:color w:val="333333"/>
+          <w:sz w:val="22"/>
+        </w:rPr>
+        <w:t xml:space="preserve"> no aplicativo móvel, seleciona o motivo e anexa uma observação.</w:t>
+      </w:r>
+    </w:p>
+    <w:p>
+      <w:pPr>
+        <w:pStyle w:val="ListBullet"/>
+        <w:spacing w:after="60" w:line="240" w:lineRule="auto"/>
+      </w:pPr>
+      <w:r>
+        <w:rPr>
+          <w:b/>
+          <w:color w:val="061A4F"/>
+          <w:sz w:val="22"/>
+        </w:rPr>
+        <w:t xml:space="preserve">Reversão Automática:</w:t>
+      </w:r>
+      <w:r>
+        <w:rPr>
+          <w:color w:val="333333"/>
+          <w:sz w:val="22"/>
+        </w:rPr>
+        <w:t xml:space="preserve"> O status do pedido retorna de </w:t>
+      </w:r>
+      <w:r>
+        <w:rPr>
+          <w:rFonts w:ascii="Consolas" w:hAnsi="Consolas"/>
+          <w:color w:val="C7254E"/>
+          <w:shd w:val="clear" w:color="auto" w:fill="F9F2F4"/>
+          <w:sz w:val="20"/>
+        </w:rPr>
+        <w:t xml:space="preserve">ROTA</w:t>
+      </w:r>
+      <w:r>
+        <w:rPr>
+          <w:color w:val="333333"/>
+          <w:sz w:val="22"/>
+        </w:rPr>
+        <w:t xml:space="preserve"> diretamente para </w:t>
+      </w:r>
+      <w:r>
+        <w:rPr>
+          <w:rFonts w:ascii="Consolas" w:hAnsi="Consolas"/>
+          <w:color w:val="C7254E"/>
+          <w:shd w:val="clear" w:color="auto" w:fill="F9F2F4"/>
+          <w:sz w:val="20"/>
+        </w:rPr>
+        <w:t xml:space="preserve">SEPARACAO</w:t>
+      </w:r>
+      <w:r>
+        <w:rPr>
+          <w:color w:val="333333"/>
+          <w:sz w:val="22"/>
+        </w:rPr>
+        <w:t xml:space="preserve">, desvinculando-se da rota do veículo e mantendo o estoque reservado.</w:t>
+      </w:r>
+    </w:p>
+    <w:p>
+      <w:pPr>
+        <w:pStyle w:val="ListBullet"/>
+        <w:spacing w:after="60" w:line="240" w:lineRule="auto"/>
+      </w:pPr>
+      <w:r>
+        <w:rPr>
+          <w:b/>
+          <w:color w:val="061A4F"/>
+          <w:sz w:val="22"/>
+        </w:rPr>
+        <w:t xml:space="preserve">Alerta Instantâneo na Torre:</w:t>
+      </w:r>
+      <w:r>
+        <w:rPr>
+          <w:color w:val="333333"/>
+          <w:sz w:val="22"/>
+        </w:rPr>
+        <w:t xml:space="preserve"> A Torre de Controle recebe o evento SSE imediatamente no painel </w:t>
+      </w:r>
+      <w:r>
+        <w:rPr>
+          <w:b/>
+          <w:color w:val="061A4F"/>
+          <w:sz w:val="22"/>
+        </w:rPr>
+        <w:t xml:space="preserve">"Pedidos que Retornaram"</w:t>
+      </w:r>
+      <w:r>
+        <w:rPr>
+          <w:color w:val="333333"/>
+          <w:sz w:val="22"/>
+        </w:rPr>
+        <w:t xml:space="preserve">, permitindo reprogramação ágil da entrega para o turno seguinte.</w:t>
+      </w:r>
+    </w:p>
+    <w:p>
+      <w:pPr>
+        <w:pStyle w:val="Heading2"/>
+        <w:spacing w:before="220" w:after="100"/>
+      </w:pPr>
+      <w:r>
+        <w:rPr>
+          <w:b/>
+          <w:color w:val="FD5E02"/>
+          <w:sz w:val="26"/>
+        </w:rPr>
+        <w:t xml:space="preserve">6. POLÍTICA DE BACKUP E SEGURANÇA</w:t>
+      </w:r>
+    </w:p>
+    <w:p>
+      <w:pPr>
+        <w:pStyle w:val="ListBullet"/>
+        <w:spacing w:after="60" w:line="240" w:lineRule="auto"/>
+      </w:pPr>
+      <w:r>
+        <w:rPr>
+          <w:b/>
+          <w:color w:val="061A4F"/>
+          <w:sz w:val="22"/>
+        </w:rPr>
+        <w:t xml:space="preserve">Disco Persistente de 10GB no Render:</w:t>
+      </w:r>
+      <w:r>
+        <w:rPr>
+          <w:color w:val="333333"/>
+          <w:sz w:val="22"/>
+        </w:rPr>
+        <w:t xml:space="preserve"> Montado em </w:t>
+      </w:r>
+      <w:r>
+        <w:rPr>
+          <w:rFonts w:ascii="Consolas" w:hAnsi="Consolas"/>
+          <w:color w:val="C7254E"/>
+          <w:shd w:val="clear" w:color="auto" w:fill="F9F2F4"/>
+          <w:sz w:val="20"/>
+        </w:rPr>
+        <w:t xml:space="preserve">/var/data</w:t>
+      </w:r>
+      <w:r>
+        <w:rPr>
+          <w:color w:val="333333"/>
+          <w:sz w:val="22"/>
+        </w:rPr>
+        <w:t xml:space="preserve"> (</w:t>
+      </w:r>
+      <w:r>
+        <w:rPr>
+          <w:rFonts w:ascii="Consolas" w:hAnsi="Consolas"/>
+          <w:color w:val="C7254E"/>
+          <w:shd w:val="clear" w:color="auto" w:fill="F9F2F4"/>
+          <w:sz w:val="20"/>
+        </w:rPr>
+        <w:t xml:space="preserve">STORAGE_DIR=/var/data</w:t>
+      </w:r>
+      <w:r>
+        <w:rPr>
+          <w:color w:val="333333"/>
+          <w:sz w:val="22"/>
+        </w:rPr>
+        <w:t xml:space="preserve">), isolando banco de dados, comprovantes de entrega, fotos de produtos e PDFs.</w:t>
+      </w:r>
+    </w:p>
+    <w:p>
+      <w:pPr>
+        <w:pStyle w:val="ListBullet"/>
+        <w:spacing w:after="60" w:line="240" w:lineRule="auto"/>
+      </w:pPr>
+      <w:r>
+        <w:rPr>
+          <w:b/>
+          <w:color w:val="061A4F"/>
+          <w:sz w:val="22"/>
+        </w:rPr>
+        <w:t xml:space="preserve">Garantia de Não Sobrescrita:</w:t>
+      </w:r>
+      <w:r>
+        <w:rPr>
+          <w:color w:val="333333"/>
+          <w:sz w:val="22"/>
+        </w:rPr>
+        <w:t xml:space="preserve"> A lógica de bootstrap em </w:t>
+      </w:r>
+      <w:r>
+        <w:rPr>
+          <w:rFonts w:ascii="Consolas" w:hAnsi="Consolas"/>
+          <w:color w:val="C7254E"/>
+          <w:shd w:val="clear" w:color="auto" w:fill="F9F2F4"/>
+          <w:sz w:val="20"/>
+        </w:rPr>
+        <w:t xml:space="preserve">src/db.js</w:t>
+      </w:r>
+      <w:r>
+        <w:rPr>
+          <w:color w:val="333333"/>
+          <w:sz w:val="22"/>
+        </w:rPr>
+        <w:t xml:space="preserve"> preserva a integridade da base existente em novos deploys de código.</w:t>
+      </w:r>
+    </w:p>
+    <w:p>
+      <w:pPr>
+        <w:pStyle w:val="ListBullet"/>
+        <w:spacing w:after="60" w:line="240" w:lineRule="auto"/>
+      </w:pPr>
+      <w:r>
+        <w:rPr>
+          <w:b/>
+          <w:color w:val="061A4F"/>
+          <w:sz w:val="22"/>
+        </w:rPr>
+        <w:t xml:space="preserve">Backups Automáticos Diários:</w:t>
+      </w:r>
+      <w:r>
+        <w:rPr>
+          <w:color w:val="333333"/>
+          <w:sz w:val="22"/>
+        </w:rPr>
+        <w:t xml:space="preserve"> Executados via </w:t>
+      </w:r>
+      <w:r>
+        <w:rPr>
+          <w:rFonts w:ascii="Consolas" w:hAnsi="Consolas"/>
+          <w:color w:val="C7254E"/>
+          <w:shd w:val="clear" w:color="auto" w:fill="F9F2F4"/>
+          <w:sz w:val="20"/>
+        </w:rPr>
+        <w:t xml:space="preserve">npm run backup</w:t>
+      </w:r>
+      <w:r>
+        <w:rPr>
+          <w:color w:val="333333"/>
+          <w:sz w:val="22"/>
+        </w:rPr>
+        <w:t xml:space="preserve">, gerando snapshots atômicos (</w:t>
+      </w:r>
+      <w:r>
+        <w:rPr>
+          <w:rFonts w:ascii="Consolas" w:hAnsi="Consolas"/>
+          <w:color w:val="C7254E"/>
+          <w:shd w:val="clear" w:color="auto" w:fill="F9F2F4"/>
+          <w:sz w:val="20"/>
+        </w:rPr>
+        <w:t xml:space="preserve">VACUUM INTO</w:t>
+      </w:r>
+      <w:r>
+        <w:rPr>
+          <w:color w:val="333333"/>
+          <w:sz w:val="22"/>
+        </w:rPr>
+        <w:t xml:space="preserve">), validação de integridade (</w:t>
+      </w:r>
+      <w:r>
+        <w:rPr>
+          <w:rFonts w:ascii="Consolas" w:hAnsi="Consolas"/>
+          <w:color w:val="C7254E"/>
+          <w:shd w:val="clear" w:color="auto" w:fill="F9F2F4"/>
+          <w:sz w:val="20"/>
+        </w:rPr>
+        <w:t xml:space="preserve">PRAGMA integrity_check</w:t>
+      </w:r>
+      <w:r>
+        <w:rPr>
+          <w:color w:val="333333"/>
+          <w:sz w:val="22"/>
+        </w:rPr>
+        <w:t xml:space="preserve">), espelhamento de mídias e retenção rolling de 7 dias com manifesto SHA256.</w:t>
       </w:r>
     </w:p>
     <w:sectPr>

</xml_diff>